<commit_message>
Fix LG step numbering to restart per activity
Word's built-in 'List Number' style shares a single counter across the whole
document, so step numbers ran on continuously (...20, 21, 97, 98) instead of
restarting at 1 for each activity. Number the steps explicitly with a hanging
indent instead.

Co-Authored-By: Claude Opus 5 (1M context) <noreply@anthropic.com>
</commit_message>
<xml_diff>
--- a/courseware/LG-Securing the Future with Quantum Computing and Cryptography.docx
+++ b/courseware/LG-Securing the Future with Quantum Computing and Cryptography.docx
@@ -606,7 +606,7 @@
           </w:rPr>
           <w:t>Topic 03 — Quantum Gates and Circuits</w:t>
           <w:tab/>
-          <w:t>13</w:t>
+          <w:t>12</w:t>
         </w:r>
       </w:hyperlink>
     </w:p>
@@ -650,7 +650,7 @@
           </w:rPr>
           <w:t>Activity 5 — Quantum Gates and Bell/GHZ States with PennyLane</w:t>
           <w:tab/>
-          <w:t>15</w:t>
+          <w:t>14</w:t>
         </w:r>
       </w:hyperlink>
     </w:p>
@@ -671,7 +671,7 @@
           </w:rPr>
           <w:t>Topic 04 — Quantum Protocols</w:t>
           <w:tab/>
-          <w:t>17</w:t>
+          <w:t>16</w:t>
         </w:r>
       </w:hyperlink>
     </w:p>
@@ -715,7 +715,7 @@
           </w:rPr>
           <w:t>Activity 7 — Superdense Coding Protocol</w:t>
           <w:tab/>
-          <w:t>19</w:t>
+          <w:t>18</w:t>
         </w:r>
       </w:hyperlink>
     </w:p>
@@ -824,7 +824,7 @@
           </w:rPr>
           <w:t>Activity 11 — Grover's Search Algorithm</w:t>
           <w:tab/>
-          <w:t>26</w:t>
+          <w:t>25</w:t>
         </w:r>
       </w:hyperlink>
     </w:p>
@@ -867,7 +867,7 @@
           </w:rPr>
           <w:t>Topic 06 — Quantum Cryptography and Quantum Safety</w:t>
           <w:tab/>
-          <w:t>29</w:t>
+          <w:t>28</w:t>
         </w:r>
       </w:hyperlink>
     </w:p>
@@ -911,7 +911,7 @@
           </w:rPr>
           <w:t>Activity 14 — Post-Quantum Cryptography Migration Assessment</w:t>
           <w:tab/>
-          <w:t>31</w:t>
+          <w:t>30</w:t>
         </w:r>
       </w:hyperlink>
     </w:p>
@@ -932,7 +932,7 @@
           </w:rPr>
           <w:t>Topic 07 — Quantum Computing Applications and Use Cases</w:t>
           <w:tab/>
-          <w:t>32</w:t>
+          <w:t>31</w:t>
         </w:r>
       </w:hyperlink>
     </w:p>
@@ -954,7 +954,7 @@
           </w:rPr>
           <w:t>Activity 15 — Molecular Simulation with VQE (Healthcare &amp; Science)</w:t>
           <w:tab/>
-          <w:t>33</w:t>
+          <w:t>32</w:t>
         </w:r>
       </w:hyperlink>
     </w:p>
@@ -976,7 +976,7 @@
           </w:rPr>
           <w:t>Activity 16 — Portfolio Optimisation with QAOA (Finance)</w:t>
           <w:tab/>
-          <w:t>34</w:t>
+          <w:t>33</w:t>
         </w:r>
       </w:hyperlink>
     </w:p>
@@ -997,7 +997,7 @@
           </w:rPr>
           <w:t>Topic 08 — Quantum Error Correction</w:t>
           <w:tab/>
-          <w:t>36</w:t>
+          <w:t>35</w:t>
         </w:r>
       </w:hyperlink>
     </w:p>
@@ -1019,7 +1019,7 @@
           </w:rPr>
           <w:t>Activity 17 — Bit-Flip and Phase-Flip Error Correction Codes</w:t>
           <w:tab/>
-          <w:t>36</w:t>
+          <w:t>35</w:t>
         </w:r>
       </w:hyperlink>
     </w:p>
@@ -1041,7 +1041,7 @@
           </w:rPr>
           <w:t>Activity 18 — Shor 9-Qubit and Steane 7-Qubit Codes</w:t>
           <w:tab/>
-          <w:t>38</w:t>
+          <w:t>37</w:t>
         </w:r>
       </w:hyperlink>
     </w:p>
@@ -1062,7 +1062,7 @@
           </w:rPr>
           <w:t>Quantum Gate Reference</w:t>
           <w:tab/>
-          <w:t>40</w:t>
+          <w:t>38</w:t>
         </w:r>
       </w:hyperlink>
     </w:p>
@@ -1083,7 +1083,7 @@
           </w:rPr>
           <w:t>Algorithm Selection Guide</w:t>
           <w:tab/>
-          <w:t>40</w:t>
+          <w:t>39</w:t>
         </w:r>
       </w:hyperlink>
     </w:p>
@@ -1104,7 +1104,7 @@
           </w:rPr>
           <w:t>Post-Quantum Cryptography Quick Reference</w:t>
           <w:tab/>
-          <w:t>40</w:t>
+          <w:t>39</w:t>
         </w:r>
       </w:hyperlink>
     </w:p>
@@ -1125,7 +1125,7 @@
           </w:rPr>
           <w:t>Assessment Preparation</w:t>
           <w:tab/>
-          <w:t>41</w:t>
+          <w:t>40</w:t>
         </w:r>
       </w:hyperlink>
     </w:p>
@@ -1146,7 +1146,7 @@
           </w:rPr>
           <w:t>Glossary</w:t>
           <w:tab/>
-          <w:t>41</w:t>
+          <w:t>40</w:t>
         </w:r>
       </w:hyperlink>
     </w:p>
@@ -1643,16 +1643,30 @@
     </w:p>
     <w:p>
       <w:pPr>
-        <w:pStyle w:val="ListNumber"/>
-      </w:pPr>
+        <w:spacing w:after="80"/>
+        <w:ind w:left="576" w:hanging="576"/>
+      </w:pPr>
+      <w:r>
+        <w:rPr>
+          <w:b/>
+        </w:rPr>
+        <w:t xml:space="preserve">1.  </w:t>
+      </w:r>
       <w:r>
         <w:t>Open Google Colab (or VS Code) and create a new Python notebook for this lab.</w:t>
       </w:r>
     </w:p>
     <w:p>
       <w:pPr>
-        <w:pStyle w:val="ListNumber"/>
-      </w:pPr>
+        <w:spacing w:after="80"/>
+        <w:ind w:left="576" w:hanging="576"/>
+      </w:pPr>
+      <w:r>
+        <w:rPr>
+          <w:b/>
+        </w:rPr>
+        <w:t xml:space="preserve">2.  </w:t>
+      </w:r>
       <w:r>
         <w:t>Import NumPy and define the computational basis states |0&gt; = [1,0] and |1&gt; = [0,1] as column vectors.</w:t>
       </w:r>
@@ -1679,8 +1693,15 @@
     </w:p>
     <w:p>
       <w:pPr>
-        <w:pStyle w:val="ListNumber"/>
-      </w:pPr>
+        <w:spacing w:after="80"/>
+        <w:ind w:left="576" w:hanging="576"/>
+      </w:pPr>
+      <w:r>
+        <w:rPr>
+          <w:b/>
+        </w:rPr>
+        <w:t xml:space="preserve">3.  </w:t>
+      </w:r>
       <w:r>
         <w:t>Build a normalised superposition state |+&gt; = (|0&gt; + |1&gt;)/sqrt(2) and confirm its norm is 1.</w:t>
       </w:r>
@@ -1707,8 +1728,15 @@
     </w:p>
     <w:p>
       <w:pPr>
-        <w:pStyle w:val="ListNumber"/>
-      </w:pPr>
+        <w:spacing w:after="80"/>
+        <w:ind w:left="576" w:hanging="576"/>
+      </w:pPr>
+      <w:r>
+        <w:rPr>
+          <w:b/>
+        </w:rPr>
+        <w:t xml:space="preserve">4.  </w:t>
+      </w:r>
       <w:r>
         <w:t>Define the Pauli-X, Pauli-Y, Pauli-Z and Hadamard matrices as NumPy arrays.</w:t>
       </w:r>
@@ -1735,8 +1763,15 @@
     </w:p>
     <w:p>
       <w:pPr>
-        <w:pStyle w:val="ListNumber"/>
-      </w:pPr>
+        <w:spacing w:after="80"/>
+        <w:ind w:left="576" w:hanging="576"/>
+      </w:pPr>
+      <w:r>
+        <w:rPr>
+          <w:b/>
+        </w:rPr>
+        <w:t xml:space="preserve">5.  </w:t>
+      </w:r>
       <w:r>
         <w:t>Verify that H is unitary by checking that H-dagger times H equals the identity.</w:t>
       </w:r>
@@ -1753,8 +1788,15 @@
     </w:p>
     <w:p>
       <w:pPr>
-        <w:pStyle w:val="ListNumber"/>
-      </w:pPr>
+        <w:spacing w:after="80"/>
+        <w:ind w:left="576" w:hanging="576"/>
+      </w:pPr>
+      <w:r>
+        <w:rPr>
+          <w:b/>
+        </w:rPr>
+        <w:t xml:space="preserve">6.  </w:t>
+      </w:r>
       <w:r>
         <w:t>Verify that X and Z are Hermitian by checking that A-dagger equals A, then confirm their eigenvalues are real.</w:t>
       </w:r>
@@ -1781,8 +1823,15 @@
     </w:p>
     <w:p>
       <w:pPr>
-        <w:pStyle w:val="ListNumber"/>
-      </w:pPr>
+        <w:spacing w:after="80"/>
+        <w:ind w:left="576" w:hanging="576"/>
+      </w:pPr>
+      <w:r>
+        <w:rPr>
+          <w:b/>
+        </w:rPr>
+        <w:t xml:space="preserve">7.  </w:t>
+      </w:r>
       <w:r>
         <w:t>Compute the eigenvalues and eigenvectors of the Pauli-Z operator and interpret them as measurement outcomes.</w:t>
       </w:r>
@@ -1809,8 +1858,15 @@
     </w:p>
     <w:p>
       <w:pPr>
-        <w:pStyle w:val="ListNumber"/>
-      </w:pPr>
+        <w:spacing w:after="80"/>
+        <w:ind w:left="576" w:hanging="576"/>
+      </w:pPr>
+      <w:r>
+        <w:rPr>
+          <w:b/>
+        </w:rPr>
+        <w:t xml:space="preserve">8.  </w:t>
+      </w:r>
       <w:r>
         <w:t>Compute the inner product &lt;0|+&gt; and apply the Born rule to obtain the probability of measuring 0.</w:t>
       </w:r>
@@ -1837,8 +1893,15 @@
     </w:p>
     <w:p>
       <w:pPr>
-        <w:pStyle w:val="ListNumber"/>
-      </w:pPr>
+        <w:spacing w:after="80"/>
+        <w:ind w:left="576" w:hanging="576"/>
+      </w:pPr>
+      <w:r>
+        <w:rPr>
+          <w:b/>
+        </w:rPr>
+        <w:t xml:space="preserve">9.  </w:t>
+      </w:r>
       <w:r>
         <w:t>Build the two-qubit state |0&gt; tensor |1&gt; using the Kronecker product and confirm it has 4 components.</w:t>
       </w:r>
@@ -1865,8 +1928,15 @@
     </w:p>
     <w:p>
       <w:pPr>
-        <w:pStyle w:val="ListNumber"/>
-      </w:pPr>
+        <w:spacing w:after="80"/>
+        <w:ind w:left="576" w:hanging="576"/>
+      </w:pPr>
+      <w:r>
+        <w:rPr>
+          <w:b/>
+        </w:rPr>
+        <w:t xml:space="preserve">10.  </w:t>
+      </w:r>
       <w:r>
         <w:t>Build the two-qubit operator H tensor I and verify that it is also unitary.</w:t>
       </w:r>
@@ -2094,8 +2164,15 @@
     </w:p>
     <w:p>
       <w:pPr>
-        <w:pStyle w:val="ListNumber"/>
-      </w:pPr>
+        <w:spacing w:after="80"/>
+        <w:ind w:left="576" w:hanging="576"/>
+      </w:pPr>
+      <w:r>
+        <w:rPr>
+          <w:b/>
+        </w:rPr>
+        <w:t xml:space="preserve">1.  </w:t>
+      </w:r>
       <w:r>
         <w:t>Install Qiskit with visualisation support in your Colab notebook or local environment.</w:t>
       </w:r>
@@ -2112,8 +2189,15 @@
     </w:p>
     <w:p>
       <w:pPr>
-        <w:pStyle w:val="ListNumber"/>
-      </w:pPr>
+        <w:spacing w:after="80"/>
+        <w:ind w:left="576" w:hanging="576"/>
+      </w:pPr>
+      <w:r>
+        <w:rPr>
+          <w:b/>
+        </w:rPr>
+        <w:t xml:space="preserve">2.  </w:t>
+      </w:r>
       <w:r>
         <w:t>Import Statevector and plot_bloch_multivector from Qiskit.</w:t>
       </w:r>
@@ -2140,8 +2224,15 @@
     </w:p>
     <w:p>
       <w:pPr>
-        <w:pStyle w:val="ListNumber"/>
-      </w:pPr>
+        <w:spacing w:after="80"/>
+        <w:ind w:left="576" w:hanging="576"/>
+      </w:pPr>
+      <w:r>
+        <w:rPr>
+          <w:b/>
+        </w:rPr>
+        <w:t xml:space="preserve">3.  </w:t>
+      </w:r>
       <w:r>
         <w:t>Create a one-qubit circuit left in the |0&gt; state and plot it — the vector points to the north pole.</w:t>
       </w:r>
@@ -2178,8 +2269,15 @@
     </w:p>
     <w:p>
       <w:pPr>
-        <w:pStyle w:val="ListNumber"/>
-      </w:pPr>
+        <w:spacing w:after="80"/>
+        <w:ind w:left="576" w:hanging="576"/>
+      </w:pPr>
+      <w:r>
+        <w:rPr>
+          <w:b/>
+        </w:rPr>
+        <w:t xml:space="preserve">4.  </w:t>
+      </w:r>
       <w:r>
         <w:t>Apply an X gate to flip the qubit to |1&gt; and re-plot — the vector now points to the south pole.</w:t>
       </w:r>
@@ -2206,8 +2304,15 @@
     </w:p>
     <w:p>
       <w:pPr>
-        <w:pStyle w:val="ListNumber"/>
-      </w:pPr>
+        <w:spacing w:after="80"/>
+        <w:ind w:left="576" w:hanging="576"/>
+      </w:pPr>
+      <w:r>
+        <w:rPr>
+          <w:b/>
+        </w:rPr>
+        <w:t xml:space="preserve">5.  </w:t>
+      </w:r>
       <w:r>
         <w:t>Apply a Hadamard gate to reach the |+&gt; state and observe the vector lying on the equator along +x.</w:t>
       </w:r>
@@ -2234,8 +2339,15 @@
     </w:p>
     <w:p>
       <w:pPr>
-        <w:pStyle w:val="ListNumber"/>
-      </w:pPr>
+        <w:spacing w:after="80"/>
+        <w:ind w:left="576" w:hanging="576"/>
+      </w:pPr>
+      <w:r>
+        <w:rPr>
+          <w:b/>
+        </w:rPr>
+        <w:t xml:space="preserve">6.  </w:t>
+      </w:r>
       <w:r>
         <w:t>Apply H then Z to reach |-&gt; and confirm the vector points along -x.</w:t>
       </w:r>
@@ -2262,8 +2374,15 @@
     </w:p>
     <w:p>
       <w:pPr>
-        <w:pStyle w:val="ListNumber"/>
-      </w:pPr>
+        <w:spacing w:after="80"/>
+        <w:ind w:left="576" w:hanging="576"/>
+      </w:pPr>
+      <w:r>
+        <w:rPr>
+          <w:b/>
+        </w:rPr>
+        <w:t xml:space="preserve">7.  </w:t>
+      </w:r>
       <w:r>
         <w:t>Apply an Ry rotation of pi/4 to create an arbitrary superposition and read off its amplitudes.</w:t>
       </w:r>
@@ -2300,8 +2419,15 @@
     </w:p>
     <w:p>
       <w:pPr>
-        <w:pStyle w:val="ListNumber"/>
-      </w:pPr>
+        <w:spacing w:after="80"/>
+        <w:ind w:left="576" w:hanging="576"/>
+      </w:pPr>
+      <w:r>
+        <w:rPr>
+          <w:b/>
+        </w:rPr>
+        <w:t xml:space="preserve">8.  </w:t>
+      </w:r>
       <w:r>
         <w:t>Apply an S gate after H and observe that a phase gate rotates the vector around the z-axis without changing measurement probabilities in the Z basis.</w:t>
       </w:r>
@@ -2328,8 +2454,15 @@
     </w:p>
     <w:p>
       <w:pPr>
-        <w:pStyle w:val="ListNumber"/>
-      </w:pPr>
+        <w:spacing w:after="80"/>
+        <w:ind w:left="576" w:hanging="576"/>
+      </w:pPr>
+      <w:r>
+        <w:rPr>
+          <w:b/>
+        </w:rPr>
+        <w:t xml:space="preserve">9.  </w:t>
+      </w:r>
       <w:r>
         <w:t>Record which gates move the vector between poles and which rotate it around the equator.</w:t>
       </w:r>
@@ -2464,8 +2597,15 @@
     </w:p>
     <w:p>
       <w:pPr>
-        <w:pStyle w:val="ListNumber"/>
-      </w:pPr>
+        <w:spacing w:after="80"/>
+        <w:ind w:left="576" w:hanging="576"/>
+      </w:pPr>
+      <w:r>
+        <w:rPr>
+          <w:b/>
+        </w:rPr>
+        <w:t xml:space="preserve">1.  </w:t>
+      </w:r>
       <w:r>
         <w:t>Sign up for a free IBM Quantum account and copy your API token from the dashboard.</w:t>
       </w:r>
@@ -2482,8 +2622,15 @@
     </w:p>
     <w:p>
       <w:pPr>
-        <w:pStyle w:val="ListNumber"/>
-      </w:pPr>
+        <w:spacing w:after="80"/>
+        <w:ind w:left="576" w:hanging="576"/>
+      </w:pPr>
+      <w:r>
+        <w:rPr>
+          <w:b/>
+        </w:rPr>
+        <w:t xml:space="preserve">2.  </w:t>
+      </w:r>
       <w:r>
         <w:t>Store the token and instance in a .env file in the labs folder so the scripts can authenticate.</w:t>
       </w:r>
@@ -2510,8 +2657,15 @@
     </w:p>
     <w:p>
       <w:pPr>
-        <w:pStyle w:val="ListNumber"/>
-      </w:pPr>
+        <w:spacing w:after="80"/>
+        <w:ind w:left="576" w:hanging="576"/>
+      </w:pPr>
+      <w:r>
+        <w:rPr>
+          <w:b/>
+        </w:rPr>
+        <w:t xml:space="preserve">3.  </w:t>
+      </w:r>
       <w:r>
         <w:t>Install the Qiskit runtime packages in your environment.</w:t>
       </w:r>
@@ -2528,8 +2682,15 @@
     </w:p>
     <w:p>
       <w:pPr>
-        <w:pStyle w:val="ListNumber"/>
-      </w:pPr>
+        <w:spacing w:after="80"/>
+        <w:ind w:left="576" w:hanging="576"/>
+      </w:pPr>
+      <w:r>
+        <w:rPr>
+          <w:b/>
+        </w:rPr>
+        <w:t xml:space="preserve">4.  </w:t>
+      </w:r>
       <w:r>
         <w:t>Build a one-qubit superposition circuit with a Hadamard gate and a measurement.</w:t>
       </w:r>
@@ -2556,8 +2717,15 @@
     </w:p>
     <w:p>
       <w:pPr>
-        <w:pStyle w:val="ListNumber"/>
-      </w:pPr>
+        <w:spacing w:after="80"/>
+        <w:ind w:left="576" w:hanging="576"/>
+      </w:pPr>
+      <w:r>
+        <w:rPr>
+          <w:b/>
+        </w:rPr>
+        <w:t xml:space="preserve">5.  </w:t>
+      </w:r>
       <w:r>
         <w:t>Build the Bell state circuit: Hadamard on qubit 0, then CNOT from qubit 0 to qubit 1.</w:t>
       </w:r>
@@ -2584,8 +2752,15 @@
     </w:p>
     <w:p>
       <w:pPr>
-        <w:pStyle w:val="ListNumber"/>
-      </w:pPr>
+        <w:spacing w:after="80"/>
+        <w:ind w:left="576" w:hanging="576"/>
+      </w:pPr>
+      <w:r>
+        <w:rPr>
+          <w:b/>
+        </w:rPr>
+        <w:t xml:space="preserve">6.  </w:t>
+      </w:r>
       <w:r>
         <w:t>Connect to IBM Quantum and select the least busy real backend with at least 2 qubits.</w:t>
       </w:r>
@@ -2622,8 +2797,15 @@
     </w:p>
     <w:p>
       <w:pPr>
-        <w:pStyle w:val="ListNumber"/>
-      </w:pPr>
+        <w:spacing w:after="80"/>
+        <w:ind w:left="576" w:hanging="576"/>
+      </w:pPr>
+      <w:r>
+        <w:rPr>
+          <w:b/>
+        </w:rPr>
+        <w:t xml:space="preserve">7.  </w:t>
+      </w:r>
       <w:r>
         <w:t>Transpile the Bell circuit for the chosen backend so it uses only that device's native gates.</w:t>
       </w:r>
@@ -2650,8 +2832,15 @@
     </w:p>
     <w:p>
       <w:pPr>
-        <w:pStyle w:val="ListNumber"/>
-      </w:pPr>
+        <w:spacing w:after="80"/>
+        <w:ind w:left="576" w:hanging="576"/>
+      </w:pPr>
+      <w:r>
+        <w:rPr>
+          <w:b/>
+        </w:rPr>
+        <w:t xml:space="preserve">8.  </w:t>
+      </w:r>
       <w:r>
         <w:t>Submit the job with the SamplerV2 primitive using 1024 shots and wait for the result.</w:t>
       </w:r>
@@ -2688,8 +2877,15 @@
     </w:p>
     <w:p>
       <w:pPr>
-        <w:pStyle w:val="ListNumber"/>
-      </w:pPr>
+        <w:spacing w:after="80"/>
+        <w:ind w:left="576" w:hanging="576"/>
+      </w:pPr>
+      <w:r>
+        <w:rPr>
+          <w:b/>
+        </w:rPr>
+        <w:t xml:space="preserve">9.  </w:t>
+      </w:r>
       <w:r>
         <w:t>Plot the measurement histogram and compare it against the ideal 50/50 split.</w:t>
       </w:r>
@@ -2706,8 +2902,15 @@
     </w:p>
     <w:p>
       <w:pPr>
-        <w:pStyle w:val="ListNumber"/>
-      </w:pPr>
+        <w:spacing w:after="80"/>
+        <w:ind w:left="576" w:hanging="576"/>
+      </w:pPr>
+      <w:r>
+        <w:rPr>
+          <w:b/>
+        </w:rPr>
+        <w:t xml:space="preserve">10.  </w:t>
+      </w:r>
       <w:r>
         <w:t>Explain why a small number of |01&gt; and |10&gt; counts appear on real hardware but never in the ideal simulation.</w:t>
       </w:r>
@@ -2915,8 +3118,15 @@
     </w:p>
     <w:p>
       <w:pPr>
-        <w:pStyle w:val="ListNumber"/>
-      </w:pPr>
+        <w:spacing w:after="80"/>
+        <w:ind w:left="576" w:hanging="576"/>
+      </w:pPr>
+      <w:r>
+        <w:rPr>
+          <w:b/>
+        </w:rPr>
+        <w:t xml:space="preserve">1.  </w:t>
+      </w:r>
       <w:r>
         <w:t>Open IBM Quantum Composer in your browser and sign in with your IBM Quantum account.</w:t>
       </w:r>
@@ -2933,48 +3143,90 @@
     </w:p>
     <w:p>
       <w:pPr>
-        <w:pStyle w:val="ListNumber"/>
-      </w:pPr>
+        <w:spacing w:after="80"/>
+        <w:ind w:left="576" w:hanging="576"/>
+      </w:pPr>
+      <w:r>
+        <w:rPr>
+          <w:b/>
+        </w:rPr>
+        <w:t xml:space="preserve">2.  </w:t>
+      </w:r>
       <w:r>
         <w:t>Create a new circuit with 2 qubits and open the Statevector and Probabilities visualisation panels.</w:t>
       </w:r>
     </w:p>
     <w:p>
       <w:pPr>
-        <w:pStyle w:val="ListNumber"/>
-      </w:pPr>
+        <w:spacing w:after="80"/>
+        <w:ind w:left="576" w:hanging="576"/>
+      </w:pPr>
+      <w:r>
+        <w:rPr>
+          <w:b/>
+        </w:rPr>
+        <w:t xml:space="preserve">3.  </w:t>
+      </w:r>
       <w:r>
         <w:t>Drag an X gate onto qubit 0 and observe the state change from |00&gt; to |01&gt; in the probability panel.</w:t>
       </w:r>
     </w:p>
     <w:p>
       <w:pPr>
-        <w:pStyle w:val="ListNumber"/>
-      </w:pPr>
+        <w:spacing w:after="80"/>
+        <w:ind w:left="576" w:hanging="576"/>
+      </w:pPr>
+      <w:r>
+        <w:rPr>
+          <w:b/>
+        </w:rPr>
+        <w:t xml:space="preserve">4.  </w:t>
+      </w:r>
       <w:r>
         <w:t>Remove the X gate, drag a Hadamard gate onto qubit 0 and observe the equal superposition appear.</w:t>
       </w:r>
     </w:p>
     <w:p>
       <w:pPr>
-        <w:pStyle w:val="ListNumber"/>
-      </w:pPr>
+        <w:spacing w:after="80"/>
+        <w:ind w:left="576" w:hanging="576"/>
+      </w:pPr>
+      <w:r>
+        <w:rPr>
+          <w:b/>
+        </w:rPr>
+        <w:t xml:space="preserve">5.  </w:t>
+      </w:r>
       <w:r>
         <w:t>Add a CNOT gate with qubit 0 as control and qubit 1 as target to create the Bell state.</w:t>
       </w:r>
     </w:p>
     <w:p>
       <w:pPr>
-        <w:pStyle w:val="ListNumber"/>
-      </w:pPr>
+        <w:spacing w:after="80"/>
+        <w:ind w:left="576" w:hanging="576"/>
+      </w:pPr>
+      <w:r>
+        <w:rPr>
+          <w:b/>
+        </w:rPr>
+        <w:t xml:space="preserve">6.  </w:t>
+      </w:r>
       <w:r>
         <w:t>Confirm the probability panel shows only |00&gt; and |11&gt; at 50% each — the signature of entanglement.</w:t>
       </w:r>
     </w:p>
     <w:p>
       <w:pPr>
-        <w:pStyle w:val="ListNumber"/>
-      </w:pPr>
+        <w:spacing w:after="80"/>
+        <w:ind w:left="576" w:hanging="576"/>
+      </w:pPr>
+      <w:r>
+        <w:rPr>
+          <w:b/>
+        </w:rPr>
+        <w:t xml:space="preserve">7.  </w:t>
+      </w:r>
       <w:r>
         <w:t>Switch to the OpenQASM view and copy the generated code for your circuit.</w:t>
       </w:r>
@@ -3031,16 +3283,30 @@
     </w:p>
     <w:p>
       <w:pPr>
-        <w:pStyle w:val="ListNumber"/>
-      </w:pPr>
+        <w:spacing w:after="80"/>
+        <w:ind w:left="576" w:hanging="576"/>
+      </w:pPr>
+      <w:r>
+        <w:rPr>
+          <w:b/>
+        </w:rPr>
+        <w:t xml:space="preserve">8.  </w:t>
+      </w:r>
       <w:r>
         <w:t>Load the provided bell-state QASM file from the labs folder into Composer and confirm it reproduces the same circuit.</w:t>
       </w:r>
     </w:p>
     <w:p>
       <w:pPr>
-        <w:pStyle w:val="ListNumber"/>
-      </w:pPr>
+        <w:spacing w:after="80"/>
+        <w:ind w:left="576" w:hanging="576"/>
+      </w:pPr>
+      <w:r>
+        <w:rPr>
+          <w:b/>
+        </w:rPr>
+        <w:t xml:space="preserve">9.  </w:t>
+      </w:r>
       <w:r>
         <w:t>Experiment with Z, S and T gates after the Hadamard and note which ones change the probability panel and which only change the phase.</w:t>
       </w:r>
@@ -3175,8 +3441,15 @@
     </w:p>
     <w:p>
       <w:pPr>
-        <w:pStyle w:val="ListNumber"/>
-      </w:pPr>
+        <w:spacing w:after="80"/>
+        <w:ind w:left="576" w:hanging="576"/>
+      </w:pPr>
+      <w:r>
+        <w:rPr>
+          <w:b/>
+        </w:rPr>
+        <w:t xml:space="preserve">1.  </w:t>
+      </w:r>
       <w:r>
         <w:t>Install PennyLane in your environment.</w:t>
       </w:r>
@@ -3193,8 +3466,15 @@
     </w:p>
     <w:p>
       <w:pPr>
-        <w:pStyle w:val="ListNumber"/>
-      </w:pPr>
+        <w:spacing w:after="80"/>
+        <w:ind w:left="576" w:hanging="576"/>
+      </w:pPr>
+      <w:r>
+        <w:rPr>
+          <w:b/>
+        </w:rPr>
+        <w:t xml:space="preserve">2.  </w:t>
+      </w:r>
       <w:r>
         <w:t>Create a 2-qubit default.qubit device to run your circuits on.</w:t>
       </w:r>
@@ -3221,8 +3501,15 @@
     </w:p>
     <w:p>
       <w:pPr>
-        <w:pStyle w:val="ListNumber"/>
-      </w:pPr>
+        <w:spacing w:after="80"/>
+        <w:ind w:left="576" w:hanging="576"/>
+      </w:pPr>
+      <w:r>
+        <w:rPr>
+          <w:b/>
+        </w:rPr>
+        <w:t xml:space="preserve">3.  </w:t>
+      </w:r>
       <w:r>
         <w:t>Write a quantum function that applies a Pauli-X to wire 0 and returns the state, then wrap it in a QNode.</w:t>
       </w:r>
@@ -3269,8 +3556,15 @@
     </w:p>
     <w:p>
       <w:pPr>
-        <w:pStyle w:val="ListNumber"/>
-      </w:pPr>
+        <w:spacing w:after="80"/>
+        <w:ind w:left="576" w:hanging="576"/>
+      </w:pPr>
+      <w:r>
+        <w:rPr>
+          <w:b/>
+        </w:rPr>
+        <w:t xml:space="preserve">4.  </w:t>
+      </w:r>
       <w:r>
         <w:t>Print the circuit diagram using PennyLane's draw function to confirm the gate placement.</w:t>
       </w:r>
@@ -3287,8 +3581,15 @@
     </w:p>
     <w:p>
       <w:pPr>
-        <w:pStyle w:val="ListNumber"/>
-      </w:pPr>
+        <w:spacing w:after="80"/>
+        <w:ind w:left="576" w:hanging="576"/>
+      </w:pPr>
+      <w:r>
+        <w:rPr>
+          <w:b/>
+        </w:rPr>
+        <w:t xml:space="preserve">5.  </w:t>
+      </w:r>
       <w:r>
         <w:t>Build the Bell state by applying a Hadamard to wire 0 followed by a CNOT from wire 0 to wire 1.</w:t>
       </w:r>
@@ -3335,8 +3636,15 @@
     </w:p>
     <w:p>
       <w:pPr>
-        <w:pStyle w:val="ListNumber"/>
-      </w:pPr>
+        <w:spacing w:after="80"/>
+        <w:ind w:left="576" w:hanging="576"/>
+      </w:pPr>
+      <w:r>
+        <w:rPr>
+          <w:b/>
+        </w:rPr>
+        <w:t xml:space="preserve">6.  </w:t>
+      </w:r>
       <w:r>
         <w:t>Print the resulting state vector and confirm the amplitudes are 0.707 on |00&gt; and |11&gt; only.</w:t>
       </w:r>
@@ -3353,8 +3661,15 @@
     </w:p>
     <w:p>
       <w:pPr>
-        <w:pStyle w:val="ListNumber"/>
-      </w:pPr>
+        <w:spacing w:after="80"/>
+        <w:ind w:left="576" w:hanging="576"/>
+      </w:pPr>
+      <w:r>
+        <w:rPr>
+          <w:b/>
+        </w:rPr>
+        <w:t xml:space="preserve">7.  </w:t>
+      </w:r>
       <w:r>
         <w:t>Change the device to 3 wires and build the GHZ state with a Hadamard and two CNOT gates.</w:t>
       </w:r>
@@ -3411,8 +3726,15 @@
     </w:p>
     <w:p>
       <w:pPr>
-        <w:pStyle w:val="ListNumber"/>
-      </w:pPr>
+        <w:spacing w:after="80"/>
+        <w:ind w:left="576" w:hanging="576"/>
+      </w:pPr>
+      <w:r>
+        <w:rPr>
+          <w:b/>
+        </w:rPr>
+        <w:t xml:space="preserve">8.  </w:t>
+      </w:r>
       <w:r>
         <w:t>Verify the GHZ state has amplitude only on |000&gt; and |111&gt;.</w:t>
       </w:r>
@@ -3429,8 +3751,15 @@
     </w:p>
     <w:p>
       <w:pPr>
-        <w:pStyle w:val="ListNumber"/>
-      </w:pPr>
+        <w:spacing w:after="80"/>
+        <w:ind w:left="576" w:hanging="576"/>
+      </w:pPr>
+      <w:r>
+        <w:rPr>
+          <w:b/>
+        </w:rPr>
+        <w:t xml:space="preserve">9.  </w:t>
+      </w:r>
       <w:r>
         <w:t>Replace the state return with qml.probs to obtain measurement probabilities instead of amplitudes.</w:t>
       </w:r>
@@ -3447,8 +3776,15 @@
     </w:p>
     <w:p>
       <w:pPr>
-        <w:pStyle w:val="ListNumber"/>
-      </w:pPr>
+        <w:spacing w:after="80"/>
+        <w:ind w:left="576" w:hanging="576"/>
+      </w:pPr>
+      <w:r>
+        <w:rPr>
+          <w:b/>
+        </w:rPr>
+        <w:t xml:space="preserve">10.  </w:t>
+      </w:r>
       <w:r>
         <w:t>Demonstrate phase kickback: apply a controlled-Z with the target in the |-&gt; eigenstate and observe the phase appear on the control qubit.</w:t>
       </w:r>
@@ -3656,8 +3992,15 @@
     </w:p>
     <w:p>
       <w:pPr>
-        <w:pStyle w:val="ListNumber"/>
-      </w:pPr>
+        <w:spacing w:after="80"/>
+        <w:ind w:left="576" w:hanging="576"/>
+      </w:pPr>
+      <w:r>
+        <w:rPr>
+          <w:b/>
+        </w:rPr>
+        <w:t xml:space="preserve">1.  </w:t>
+      </w:r>
       <w:r>
         <w:t>Open the quantum-teleportation lab folder and review main.py before running it.</w:t>
       </w:r>
@@ -3674,8 +4017,15 @@
     </w:p>
     <w:p>
       <w:pPr>
-        <w:pStyle w:val="ListNumber"/>
-      </w:pPr>
+        <w:spacing w:after="80"/>
+        <w:ind w:left="576" w:hanging="576"/>
+      </w:pPr>
+      <w:r>
+        <w:rPr>
+          <w:b/>
+        </w:rPr>
+        <w:t xml:space="preserve">2.  </w:t>
+      </w:r>
       <w:r>
         <w:t>Create a 3-qubit circuit: q0 carries the state to teleport, q1 and q2 form the entangled pair.</w:t>
       </w:r>
@@ -3702,8 +4052,15 @@
     </w:p>
     <w:p>
       <w:pPr>
-        <w:pStyle w:val="ListNumber"/>
-      </w:pPr>
+        <w:spacing w:after="80"/>
+        <w:ind w:left="576" w:hanging="576"/>
+      </w:pPr>
+      <w:r>
+        <w:rPr>
+          <w:b/>
+        </w:rPr>
+        <w:t xml:space="preserve">3.  </w:t>
+      </w:r>
       <w:r>
         <w:t>Prepare an arbitrary state on q0 using a rotation so you have something non-trivial to teleport.</w:t>
       </w:r>
@@ -3730,8 +4087,15 @@
     </w:p>
     <w:p>
       <w:pPr>
-        <w:pStyle w:val="ListNumber"/>
-      </w:pPr>
+        <w:spacing w:after="80"/>
+        <w:ind w:left="576" w:hanging="576"/>
+      </w:pPr>
+      <w:r>
+        <w:rPr>
+          <w:b/>
+        </w:rPr>
+        <w:t xml:space="preserve">4.  </w:t>
+      </w:r>
       <w:r>
         <w:t>Create the Bell pair between q1 and q2 with a Hadamard and a CNOT.</w:t>
       </w:r>
@@ -3748,8 +4112,15 @@
     </w:p>
     <w:p>
       <w:pPr>
-        <w:pStyle w:val="ListNumber"/>
-      </w:pPr>
+        <w:spacing w:after="80"/>
+        <w:ind w:left="576" w:hanging="576"/>
+      </w:pPr>
+      <w:r>
+        <w:rPr>
+          <w:b/>
+        </w:rPr>
+        <w:t xml:space="preserve">5.  </w:t>
+      </w:r>
       <w:r>
         <w:t>Perform Alice's Bell measurement: CNOT from q0 to q1, then a Hadamard on q0.</w:t>
       </w:r>
@@ -3766,8 +4137,15 @@
     </w:p>
     <w:p>
       <w:pPr>
-        <w:pStyle w:val="ListNumber"/>
-      </w:pPr>
+        <w:spacing w:after="80"/>
+        <w:ind w:left="576" w:hanging="576"/>
+      </w:pPr>
+      <w:r>
+        <w:rPr>
+          <w:b/>
+        </w:rPr>
+        <w:t xml:space="preserve">6.  </w:t>
+      </w:r>
       <w:r>
         <w:t>Measure q0 and q1 into the classical register — these are the two classical bits sent to Bob.</w:t>
       </w:r>
@@ -3784,8 +4162,15 @@
     </w:p>
     <w:p>
       <w:pPr>
-        <w:pStyle w:val="ListNumber"/>
-      </w:pPr>
+        <w:spacing w:after="80"/>
+        <w:ind w:left="576" w:hanging="576"/>
+      </w:pPr>
+      <w:r>
+        <w:rPr>
+          <w:b/>
+        </w:rPr>
+        <w:t xml:space="preserve">7.  </w:t>
+      </w:r>
       <w:r>
         <w:t>Apply Bob's conditional corrections: an X gate if bit 1 is set and a Z gate if bit 0 is set.</w:t>
       </w:r>
@@ -3812,8 +4197,15 @@
     </w:p>
     <w:p>
       <w:pPr>
-        <w:pStyle w:val="ListNumber"/>
-      </w:pPr>
+        <w:spacing w:after="80"/>
+        <w:ind w:left="576" w:hanging="576"/>
+      </w:pPr>
+      <w:r>
+        <w:rPr>
+          <w:b/>
+        </w:rPr>
+        <w:t xml:space="preserve">8.  </w:t>
+      </w:r>
       <w:r>
         <w:t>Measure q2 and run the circuit on the least busy IBM Quantum backend.</w:t>
       </w:r>
@@ -3830,16 +4222,30 @@
     </w:p>
     <w:p>
       <w:pPr>
-        <w:pStyle w:val="ListNumber"/>
-      </w:pPr>
+        <w:spacing w:after="80"/>
+        <w:ind w:left="576" w:hanging="576"/>
+      </w:pPr>
+      <w:r>
+        <w:rPr>
+          <w:b/>
+        </w:rPr>
+        <w:t xml:space="preserve">9.  </w:t>
+      </w:r>
       <w:r>
         <w:t>Compare the measured distribution on q2 against the original state prepared on q0.</w:t>
       </w:r>
     </w:p>
     <w:p>
       <w:pPr>
-        <w:pStyle w:val="ListNumber"/>
-      </w:pPr>
+        <w:spacing w:after="80"/>
+        <w:ind w:left="576" w:hanging="576"/>
+      </w:pPr>
+      <w:r>
+        <w:rPr>
+          <w:b/>
+        </w:rPr>
+        <w:t xml:space="preserve">10.  </w:t>
+      </w:r>
       <w:r>
         <w:t>Explain why teleportation does not violate the no-cloning theorem — the original state is destroyed by the Bell measurement.</w:t>
       </w:r>
@@ -3974,8 +4380,15 @@
     </w:p>
     <w:p>
       <w:pPr>
-        <w:pStyle w:val="ListNumber"/>
-      </w:pPr>
+        <w:spacing w:after="80"/>
+        <w:ind w:left="576" w:hanging="576"/>
+      </w:pPr>
+      <w:r>
+        <w:rPr>
+          <w:b/>
+        </w:rPr>
+        <w:t xml:space="preserve">1.  </w:t>
+      </w:r>
       <w:r>
         <w:t>Open the superdense-coding lab folder and review the encoding table in main.py.</w:t>
       </w:r>
@@ -3992,8 +4405,15 @@
     </w:p>
     <w:p>
       <w:pPr>
-        <w:pStyle w:val="ListNumber"/>
-      </w:pPr>
+        <w:spacing w:after="80"/>
+        <w:ind w:left="576" w:hanging="576"/>
+      </w:pPr>
+      <w:r>
+        <w:rPr>
+          <w:b/>
+        </w:rPr>
+        <w:t xml:space="preserve">2.  </w:t>
+      </w:r>
       <w:r>
         <w:t>Create a 2-qubit circuit and build the shared Bell pair with a Hadamard and CNOT.</w:t>
       </w:r>
@@ -4020,16 +4440,30 @@
     </w:p>
     <w:p>
       <w:pPr>
-        <w:pStyle w:val="ListNumber"/>
-      </w:pPr>
+        <w:spacing w:after="80"/>
+        <w:ind w:left="576" w:hanging="576"/>
+      </w:pPr>
+      <w:r>
+        <w:rPr>
+          <w:b/>
+        </w:rPr>
+        <w:t xml:space="preserve">3.  </w:t>
+      </w:r>
       <w:r>
         <w:t>Encode the message 00 by applying the identity — that is, doing nothing to Alice's qubit.</w:t>
       </w:r>
     </w:p>
     <w:p>
       <w:pPr>
-        <w:pStyle w:val="ListNumber"/>
-      </w:pPr>
+        <w:spacing w:after="80"/>
+        <w:ind w:left="576" w:hanging="576"/>
+      </w:pPr>
+      <w:r>
+        <w:rPr>
+          <w:b/>
+        </w:rPr>
+        <w:t xml:space="preserve">4.  </w:t>
+      </w:r>
       <w:r>
         <w:t>Encode the message 01 by applying an X gate to Alice's qubit.</w:t>
       </w:r>
@@ -4046,8 +4480,15 @@
     </w:p>
     <w:p>
       <w:pPr>
-        <w:pStyle w:val="ListNumber"/>
-      </w:pPr>
+        <w:spacing w:after="80"/>
+        <w:ind w:left="576" w:hanging="576"/>
+      </w:pPr>
+      <w:r>
+        <w:rPr>
+          <w:b/>
+        </w:rPr>
+        <w:t xml:space="preserve">5.  </w:t>
+      </w:r>
       <w:r>
         <w:t>Encode the message 10 by applying a Z gate to Alice's qubit.</w:t>
       </w:r>
@@ -4064,8 +4505,15 @@
     </w:p>
     <w:p>
       <w:pPr>
-        <w:pStyle w:val="ListNumber"/>
-      </w:pPr>
+        <w:spacing w:after="80"/>
+        <w:ind w:left="576" w:hanging="576"/>
+      </w:pPr>
+      <w:r>
+        <w:rPr>
+          <w:b/>
+        </w:rPr>
+        <w:t xml:space="preserve">6.  </w:t>
+      </w:r>
       <w:r>
         <w:t>Encode the message 11 by applying both Z and X to Alice's qubit.</w:t>
       </w:r>
@@ -4082,8 +4530,15 @@
     </w:p>
     <w:p>
       <w:pPr>
-        <w:pStyle w:val="ListNumber"/>
-      </w:pPr>
+        <w:spacing w:after="80"/>
+        <w:ind w:left="576" w:hanging="576"/>
+      </w:pPr>
+      <w:r>
+        <w:rPr>
+          <w:b/>
+        </w:rPr>
+        <w:t xml:space="preserve">7.  </w:t>
+      </w:r>
       <w:r>
         <w:t>Decode by reversing the entangling operation: CNOT then Hadamard, and measure both qubits.</w:t>
       </w:r>
@@ -4110,8 +4565,15 @@
     </w:p>
     <w:p>
       <w:pPr>
-        <w:pStyle w:val="ListNumber"/>
-      </w:pPr>
+        <w:spacing w:after="80"/>
+        <w:ind w:left="576" w:hanging="576"/>
+      </w:pPr>
+      <w:r>
+        <w:rPr>
+          <w:b/>
+        </w:rPr>
+        <w:t xml:space="preserve">8.  </w:t>
+      </w:r>
       <w:r>
         <w:t>Run all four encodings on IBM Quantum hardware and record the measured bit strings.</w:t>
       </w:r>
@@ -4128,8 +4590,15 @@
     </w:p>
     <w:p>
       <w:pPr>
-        <w:pStyle w:val="ListNumber"/>
-      </w:pPr>
+        <w:spacing w:after="80"/>
+        <w:ind w:left="576" w:hanging="576"/>
+      </w:pPr>
+      <w:r>
+        <w:rPr>
+          <w:b/>
+        </w:rPr>
+        <w:t xml:space="preserve">9.  </w:t>
+      </w:r>
       <w:r>
         <w:t>Confirm each encoding decodes to its intended two-bit message with high probability.</w:t>
       </w:r>
@@ -4264,8 +4733,15 @@
     </w:p>
     <w:p>
       <w:pPr>
-        <w:pStyle w:val="ListNumber"/>
-      </w:pPr>
+        <w:spacing w:after="80"/>
+        <w:ind w:left="576" w:hanging="576"/>
+      </w:pPr>
+      <w:r>
+        <w:rPr>
+          <w:b/>
+        </w:rPr>
+        <w:t xml:space="preserve">1.  </w:t>
+      </w:r>
       <w:r>
         <w:t>Open the bb84 lab folder — it contains a run without eavesdropping and a run with eavesdropping.</w:t>
       </w:r>
@@ -4282,8 +4758,15 @@
     </w:p>
     <w:p>
       <w:pPr>
-        <w:pStyle w:val="ListNumber"/>
-      </w:pPr>
+        <w:spacing w:after="80"/>
+        <w:ind w:left="576" w:hanging="576"/>
+      </w:pPr>
+      <w:r>
+        <w:rPr>
+          <w:b/>
+        </w:rPr>
+        <w:t xml:space="preserve">2.  </w:t>
+      </w:r>
       <w:r>
         <w:t>Review how Alice generates a random bit string and a random basis string for each qubit.</w:t>
       </w:r>
@@ -4300,24 +4783,45 @@
     </w:p>
     <w:p>
       <w:pPr>
-        <w:pStyle w:val="ListNumber"/>
-      </w:pPr>
+        <w:spacing w:after="80"/>
+        <w:ind w:left="576" w:hanging="576"/>
+      </w:pPr>
+      <w:r>
+        <w:rPr>
+          <w:b/>
+        </w:rPr>
+        <w:t xml:space="preserve">3.  </w:t>
+      </w:r>
       <w:r>
         <w:t>Understand the encoding rule: in the Z basis send |0&gt; or |1&gt;; in the X basis send |+&gt; or |-&gt;.</w:t>
       </w:r>
     </w:p>
     <w:p>
       <w:pPr>
-        <w:pStyle w:val="ListNumber"/>
-      </w:pPr>
+        <w:spacing w:after="80"/>
+        <w:ind w:left="576" w:hanging="576"/>
+      </w:pPr>
+      <w:r>
+        <w:rPr>
+          <w:b/>
+        </w:rPr>
+        <w:t xml:space="preserve">4.  </w:t>
+      </w:r>
       <w:r>
         <w:t>Note how Bob independently chooses a random measurement basis for each incoming qubit.</w:t>
       </w:r>
     </w:p>
     <w:p>
       <w:pPr>
-        <w:pStyle w:val="ListNumber"/>
-      </w:pPr>
+        <w:spacing w:after="80"/>
+        <w:ind w:left="576" w:hanging="576"/>
+      </w:pPr>
+      <w:r>
+        <w:rPr>
+          <w:b/>
+        </w:rPr>
+        <w:t xml:space="preserve">5.  </w:t>
+      </w:r>
       <w:r>
         <w:t>Run the protocol without an eavesdropper and observe the sifted key after basis reconciliation.</w:t>
       </w:r>
@@ -4334,16 +4838,30 @@
     </w:p>
     <w:p>
       <w:pPr>
-        <w:pStyle w:val="ListNumber"/>
-      </w:pPr>
+        <w:spacing w:after="80"/>
+        <w:ind w:left="576" w:hanging="576"/>
+      </w:pPr>
+      <w:r>
+        <w:rPr>
+          <w:b/>
+        </w:rPr>
+        <w:t xml:space="preserve">6.  </w:t>
+      </w:r>
       <w:r>
         <w:t>Confirm that where Alice and Bob used the same basis, their bits agree almost perfectly.</w:t>
       </w:r>
     </w:p>
     <w:p>
       <w:pPr>
-        <w:pStyle w:val="ListNumber"/>
-      </w:pPr>
+        <w:spacing w:after="80"/>
+        <w:ind w:left="576" w:hanging="576"/>
+      </w:pPr>
+      <w:r>
+        <w:rPr>
+          <w:b/>
+        </w:rPr>
+        <w:t xml:space="preserve">7.  </w:t>
+      </w:r>
       <w:r>
         <w:t>Now run the version with Eve performing an intercept-resend attack on the channel.</w:t>
       </w:r>
@@ -4360,24 +4878,45 @@
     </w:p>
     <w:p>
       <w:pPr>
-        <w:pStyle w:val="ListNumber"/>
-      </w:pPr>
+        <w:spacing w:after="80"/>
+        <w:ind w:left="576" w:hanging="576"/>
+      </w:pPr>
+      <w:r>
+        <w:rPr>
+          <w:b/>
+        </w:rPr>
+        <w:t xml:space="preserve">8.  </w:t>
+      </w:r>
       <w:r>
         <w:t>Compare the error rate in the sifted key between the two runs.</w:t>
       </w:r>
     </w:p>
     <w:p>
       <w:pPr>
-        <w:pStyle w:val="ListNumber"/>
-      </w:pPr>
+        <w:spacing w:after="80"/>
+        <w:ind w:left="576" w:hanging="576"/>
+      </w:pPr>
+      <w:r>
+        <w:rPr>
+          <w:b/>
+        </w:rPr>
+        <w:t xml:space="preserve">9.  </w:t>
+      </w:r>
       <w:r>
         <w:t>Explain why Eve's measurement disturbs the state and produces roughly a 25% error rate in the sifted key.</w:t>
       </w:r>
     </w:p>
     <w:p>
       <w:pPr>
-        <w:pStyle w:val="ListNumber"/>
-      </w:pPr>
+        <w:spacing w:after="80"/>
+        <w:ind w:left="576" w:hanging="576"/>
+      </w:pPr>
+      <w:r>
+        <w:rPr>
+          <w:b/>
+        </w:rPr>
+        <w:t xml:space="preserve">10.  </w:t>
+      </w:r>
       <w:r>
         <w:t>Discuss how Alice and Bob decide to discard the key when the measured error rate exceeds their security threshold.</w:t>
       </w:r>
@@ -4585,8 +5124,15 @@
     </w:p>
     <w:p>
       <w:pPr>
-        <w:pStyle w:val="ListNumber"/>
-      </w:pPr>
+        <w:spacing w:after="80"/>
+        <w:ind w:left="576" w:hanging="576"/>
+      </w:pPr>
+      <w:r>
+        <w:rPr>
+          <w:b/>
+        </w:rPr>
+        <w:t xml:space="preserve">1.  </w:t>
+      </w:r>
       <w:r>
         <w:t>Open the deutsch-algorithm lab and review the four oracle constructions in main.py.</w:t>
       </w:r>
@@ -4603,16 +5149,30 @@
     </w:p>
     <w:p>
       <w:pPr>
-        <w:pStyle w:val="ListNumber"/>
-      </w:pPr>
+        <w:spacing w:after="80"/>
+        <w:ind w:left="576" w:hanging="576"/>
+      </w:pPr>
+      <w:r>
+        <w:rPr>
+          <w:b/>
+        </w:rPr>
+        <w:t xml:space="preserve">2.  </w:t>
+      </w:r>
       <w:r>
         <w:t>Understand the oracle convention |x&gt;|y&gt; maps to |x&gt;|y XOR f(x)&gt;, which keeps the operation reversible.</w:t>
       </w:r>
     </w:p>
     <w:p>
       <w:pPr>
-        <w:pStyle w:val="ListNumber"/>
-      </w:pPr>
+        <w:spacing w:after="80"/>
+        <w:ind w:left="576" w:hanging="576"/>
+      </w:pPr>
+      <w:r>
+        <w:rPr>
+          <w:b/>
+        </w:rPr>
+        <w:t xml:space="preserve">3.  </w:t>
+      </w:r>
       <w:r>
         <w:t>Build the Deutsch circuit: initialise q1 to |1&gt;, apply Hadamard to both qubits.</w:t>
       </w:r>
@@ -4639,8 +5199,15 @@
     </w:p>
     <w:p>
       <w:pPr>
-        <w:pStyle w:val="ListNumber"/>
-      </w:pPr>
+        <w:spacing w:after="80"/>
+        <w:ind w:left="576" w:hanging="576"/>
+      </w:pPr>
+      <w:r>
+        <w:rPr>
+          <w:b/>
+        </w:rPr>
+        <w:t xml:space="preserve">4.  </w:t>
+      </w:r>
       <w:r>
         <w:t>Apply the oracle for the balanced_identity case, which is a single CNOT.</w:t>
       </w:r>
@@ -4657,8 +5224,15 @@
     </w:p>
     <w:p>
       <w:pPr>
-        <w:pStyle w:val="ListNumber"/>
-      </w:pPr>
+        <w:spacing w:after="80"/>
+        <w:ind w:left="576" w:hanging="576"/>
+      </w:pPr>
+      <w:r>
+        <w:rPr>
+          <w:b/>
+        </w:rPr>
+        <w:t xml:space="preserve">5.  </w:t>
+      </w:r>
       <w:r>
         <w:t>Apply a final Hadamard to q0 and measure it — 0 means constant, 1 means balanced.</w:t>
       </w:r>
@@ -4675,8 +5249,15 @@
     </w:p>
     <w:p>
       <w:pPr>
-        <w:pStyle w:val="ListNumber"/>
-      </w:pPr>
+        <w:spacing w:after="80"/>
+        <w:ind w:left="576" w:hanging="576"/>
+      </w:pPr>
+      <w:r>
+        <w:rPr>
+          <w:b/>
+        </w:rPr>
+        <w:t xml:space="preserve">6.  </w:t>
+      </w:r>
       <w:r>
         <w:t>Run the circuit against all four oracles and confirm each is classified correctly in one query.</w:t>
       </w:r>
@@ -4693,16 +5274,30 @@
     </w:p>
     <w:p>
       <w:pPr>
-        <w:pStyle w:val="ListNumber"/>
-      </w:pPr>
+        <w:spacing w:after="80"/>
+        <w:ind w:left="576" w:hanging="576"/>
+      </w:pPr>
+      <w:r>
+        <w:rPr>
+          <w:b/>
+        </w:rPr>
+        <w:t xml:space="preserve">7.  </w:t>
+      </w:r>
       <w:r>
         <w:t>Explain how phase kickback makes the oracle mark the input register rather than the output register.</w:t>
       </w:r>
     </w:p>
     <w:p>
       <w:pPr>
-        <w:pStyle w:val="ListNumber"/>
-      </w:pPr>
+        <w:spacing w:after="80"/>
+        <w:ind w:left="576" w:hanging="576"/>
+      </w:pPr>
+      <w:r>
+        <w:rPr>
+          <w:b/>
+        </w:rPr>
+        <w:t xml:space="preserve">8.  </w:t>
+      </w:r>
       <w:r>
         <w:t>Move to the deutsch-jozsa lab and review how the oracle generalises to n input qubits.</w:t>
       </w:r>
@@ -4719,8 +5314,15 @@
     </w:p>
     <w:p>
       <w:pPr>
-        <w:pStyle w:val="ListNumber"/>
-      </w:pPr>
+        <w:spacing w:after="80"/>
+        <w:ind w:left="576" w:hanging="576"/>
+      </w:pPr>
+      <w:r>
+        <w:rPr>
+          <w:b/>
+        </w:rPr>
+        <w:t xml:space="preserve">9.  </w:t>
+      </w:r>
       <w:r>
         <w:t>Run the Deutsch-Jozsa algorithm and confirm that an all-zeros measurement means constant and any other result means balanced.</w:t>
       </w:r>
@@ -4737,8 +5339,15 @@
     </w:p>
     <w:p>
       <w:pPr>
-        <w:pStyle w:val="ListNumber"/>
-      </w:pPr>
+        <w:spacing w:after="80"/>
+        <w:ind w:left="576" w:hanging="576"/>
+      </w:pPr>
+      <w:r>
+        <w:rPr>
+          <w:b/>
+        </w:rPr>
+        <w:t xml:space="preserve">10.  </w:t>
+      </w:r>
       <w:r>
         <w:t>Compare the single quantum query against the 2^(n-1)+1 classical queries needed in the worst case.</w:t>
       </w:r>
@@ -4873,8 +5482,15 @@
     </w:p>
     <w:p>
       <w:pPr>
-        <w:pStyle w:val="ListNumber"/>
-      </w:pPr>
+        <w:spacing w:after="80"/>
+        <w:ind w:left="576" w:hanging="576"/>
+      </w:pPr>
+      <w:r>
+        <w:rPr>
+          <w:b/>
+        </w:rPr>
+        <w:t xml:space="preserve">1.  </w:t>
+      </w:r>
       <w:r>
         <w:t>Open the bernstein-vazirani-algorithm lab and choose a hidden string, for example s = 1011.</w:t>
       </w:r>
@@ -4891,8 +5507,15 @@
     </w:p>
     <w:p>
       <w:pPr>
-        <w:pStyle w:val="ListNumber"/>
-      </w:pPr>
+        <w:spacing w:after="80"/>
+        <w:ind w:left="576" w:hanging="576"/>
+      </w:pPr>
+      <w:r>
+        <w:rPr>
+          <w:b/>
+        </w:rPr>
+        <w:t xml:space="preserve">2.  </w:t>
+      </w:r>
       <w:r>
         <w:t>Create a circuit with n input qubits plus one ancilla, and set the ancilla to |1&gt;.</w:t>
       </w:r>
@@ -4919,8 +5542,15 @@
     </w:p>
     <w:p>
       <w:pPr>
-        <w:pStyle w:val="ListNumber"/>
-      </w:pPr>
+        <w:spacing w:after="80"/>
+        <w:ind w:left="576" w:hanging="576"/>
+      </w:pPr>
+      <w:r>
+        <w:rPr>
+          <w:b/>
+        </w:rPr>
+        <w:t xml:space="preserve">3.  </w:t>
+      </w:r>
       <w:r>
         <w:t>Apply Hadamard gates to every qubit including the ancilla.</w:t>
       </w:r>
@@ -4937,8 +5567,15 @@
     </w:p>
     <w:p>
       <w:pPr>
-        <w:pStyle w:val="ListNumber"/>
-      </w:pPr>
+        <w:spacing w:after="80"/>
+        <w:ind w:left="576" w:hanging="576"/>
+      </w:pPr>
+      <w:r>
+        <w:rPr>
+          <w:b/>
+        </w:rPr>
+        <w:t xml:space="preserve">4.  </w:t>
+      </w:r>
       <w:r>
         <w:t>Build the oracle by placing a CNOT from input qubit i to the ancilla wherever bit i of s is 1.</w:t>
       </w:r>
@@ -4965,8 +5602,15 @@
     </w:p>
     <w:p>
       <w:pPr>
-        <w:pStyle w:val="ListNumber"/>
-      </w:pPr>
+        <w:spacing w:after="80"/>
+        <w:ind w:left="576" w:hanging="576"/>
+      </w:pPr>
+      <w:r>
+        <w:rPr>
+          <w:b/>
+        </w:rPr>
+        <w:t xml:space="preserve">5.  </w:t>
+      </w:r>
       <w:r>
         <w:t>Apply Hadamard gates to the input qubits again to complete the interference step.</w:t>
       </w:r>
@@ -4983,8 +5627,15 @@
     </w:p>
     <w:p>
       <w:pPr>
-        <w:pStyle w:val="ListNumber"/>
-      </w:pPr>
+        <w:spacing w:after="80"/>
+        <w:ind w:left="576" w:hanging="576"/>
+      </w:pPr>
+      <w:r>
+        <w:rPr>
+          <w:b/>
+        </w:rPr>
+        <w:t xml:space="preserve">6.  </w:t>
+      </w:r>
       <w:r>
         <w:t>Measure the input register and run the circuit on IBM Quantum hardware.</w:t>
       </w:r>
@@ -5001,24 +5652,45 @@
     </w:p>
     <w:p>
       <w:pPr>
-        <w:pStyle w:val="ListNumber"/>
-      </w:pPr>
+        <w:spacing w:after="80"/>
+        <w:ind w:left="576" w:hanging="576"/>
+      </w:pPr>
+      <w:r>
+        <w:rPr>
+          <w:b/>
+        </w:rPr>
+        <w:t xml:space="preserve">7.  </w:t>
+      </w:r>
       <w:r>
         <w:t>Confirm the most frequent measurement outcome is exactly the hidden string s.</w:t>
       </w:r>
     </w:p>
     <w:p>
       <w:pPr>
-        <w:pStyle w:val="ListNumber"/>
-      </w:pPr>
+        <w:spacing w:after="80"/>
+        <w:ind w:left="576" w:hanging="576"/>
+      </w:pPr>
+      <w:r>
+        <w:rPr>
+          <w:b/>
+        </w:rPr>
+        <w:t xml:space="preserve">8.  </w:t>
+      </w:r>
       <w:r>
         <w:t>Repeat with a different hidden string and verify the algorithm recovers it in one query again.</w:t>
       </w:r>
     </w:p>
     <w:p>
       <w:pPr>
-        <w:pStyle w:val="ListNumber"/>
-      </w:pPr>
+        <w:spacing w:after="80"/>
+        <w:ind w:left="576" w:hanging="576"/>
+      </w:pPr>
+      <w:r>
+        <w:rPr>
+          <w:b/>
+        </w:rPr>
+        <w:t xml:space="preserve">9.  </w:t>
+      </w:r>
       <w:r>
         <w:t>Explain why n classical queries are required to learn n bits, while the quantum circuit needs only one.</w:t>
       </w:r>
@@ -5153,8 +5825,15 @@
     </w:p>
     <w:p>
       <w:pPr>
-        <w:pStyle w:val="ListNumber"/>
-      </w:pPr>
+        <w:spacing w:after="80"/>
+        <w:ind w:left="576" w:hanging="576"/>
+      </w:pPr>
+      <w:r>
+        <w:rPr>
+          <w:b/>
+        </w:rPr>
+        <w:t xml:space="preserve">1.  </w:t>
+      </w:r>
       <w:r>
         <w:t>Open the grover-algorithm lab, which contains both the 2-qubit and 3-qubit versions.</w:t>
       </w:r>
@@ -5171,8 +5850,15 @@
     </w:p>
     <w:p>
       <w:pPr>
-        <w:pStyle w:val="ListNumber"/>
-      </w:pPr>
+        <w:spacing w:after="80"/>
+        <w:ind w:left="576" w:hanging="576"/>
+      </w:pPr>
+      <w:r>
+        <w:rPr>
+          <w:b/>
+        </w:rPr>
+        <w:t xml:space="preserve">2.  </w:t>
+      </w:r>
       <w:r>
         <w:t>Initialise the register in an equal superposition of all N = 2^n basis states with Hadamards.</w:t>
       </w:r>
@@ -5199,8 +5885,15 @@
     </w:p>
     <w:p>
       <w:pPr>
-        <w:pStyle w:val="ListNumber"/>
-      </w:pPr>
+        <w:spacing w:after="80"/>
+        <w:ind w:left="576" w:hanging="576"/>
+      </w:pPr>
+      <w:r>
+        <w:rPr>
+          <w:b/>
+        </w:rPr>
+        <w:t xml:space="preserve">3.  </w:t>
+      </w:r>
       <w:r>
         <w:t>Build the phase oracle that flips the sign of the marked state — for |11&gt; this is a controlled-Z.</w:t>
       </w:r>
@@ -5217,8 +5910,15 @@
     </w:p>
     <w:p>
       <w:pPr>
-        <w:pStyle w:val="ListNumber"/>
-      </w:pPr>
+        <w:spacing w:after="80"/>
+        <w:ind w:left="576" w:hanging="576"/>
+      </w:pPr>
+      <w:r>
+        <w:rPr>
+          <w:b/>
+        </w:rPr>
+        <w:t xml:space="preserve">4.  </w:t>
+      </w:r>
       <w:r>
         <w:t>Build the diffuser: Hadamards, X gates, a controlled-Z, then X gates and Hadamards again.</w:t>
       </w:r>
@@ -5235,8 +5935,15 @@
     </w:p>
     <w:p>
       <w:pPr>
-        <w:pStyle w:val="ListNumber"/>
-      </w:pPr>
+        <w:spacing w:after="80"/>
+        <w:ind w:left="576" w:hanging="576"/>
+      </w:pPr>
+      <w:r>
+        <w:rPr>
+          <w:b/>
+        </w:rPr>
+        <w:t xml:space="preserve">5.  </w:t>
+      </w:r>
       <w:r>
         <w:t>Measure the register and run the 2-qubit search — one Grover iteration is optimal here.</w:t>
       </w:r>
@@ -5253,40 +5960,75 @@
     </w:p>
     <w:p>
       <w:pPr>
-        <w:pStyle w:val="ListNumber"/>
-      </w:pPr>
+        <w:spacing w:after="80"/>
+        <w:ind w:left="576" w:hanging="576"/>
+      </w:pPr>
+      <w:r>
+        <w:rPr>
+          <w:b/>
+        </w:rPr>
+        <w:t xml:space="preserve">6.  </w:t>
+      </w:r>
       <w:r>
         <w:t>Confirm the marked state is measured with close to 100% probability after a single iteration.</w:t>
       </w:r>
     </w:p>
     <w:p>
       <w:pPr>
-        <w:pStyle w:val="ListNumber"/>
-      </w:pPr>
+        <w:spacing w:after="80"/>
+        <w:ind w:left="576" w:hanging="576"/>
+      </w:pPr>
+      <w:r>
+        <w:rPr>
+          <w:b/>
+        </w:rPr>
+        <w:t xml:space="preserve">7.  </w:t>
+      </w:r>
       <w:r>
         <w:t>Move to the 3-qubit case and compute the optimal number of iterations as about pi/4 times sqrt(N).</w:t>
       </w:r>
     </w:p>
     <w:p>
       <w:pPr>
-        <w:pStyle w:val="ListNumber"/>
-      </w:pPr>
+        <w:spacing w:after="80"/>
+        <w:ind w:left="576" w:hanging="576"/>
+      </w:pPr>
+      <w:r>
+        <w:rPr>
+          <w:b/>
+        </w:rPr>
+        <w:t xml:space="preserve">8.  </w:t>
+      </w:r>
       <w:r>
         <w:t>Run the 3-qubit search with 2 iterations and confirm the marked state dominates the histogram.</w:t>
       </w:r>
     </w:p>
     <w:p>
       <w:pPr>
-        <w:pStyle w:val="ListNumber"/>
-      </w:pPr>
+        <w:spacing w:after="80"/>
+        <w:ind w:left="576" w:hanging="576"/>
+      </w:pPr>
+      <w:r>
+        <w:rPr>
+          <w:b/>
+        </w:rPr>
+        <w:t xml:space="preserve">9.  </w:t>
+      </w:r>
       <w:r>
         <w:t>Demonstrate over-rotation by applying too many iterations and observing the success probability fall.</w:t>
       </w:r>
     </w:p>
     <w:p>
       <w:pPr>
-        <w:pStyle w:val="ListNumber"/>
-      </w:pPr>
+        <w:spacing w:after="80"/>
+        <w:ind w:left="576" w:hanging="576"/>
+      </w:pPr>
+      <w:r>
+        <w:rPr>
+          <w:b/>
+        </w:rPr>
+        <w:t xml:space="preserve">10.  </w:t>
+      </w:r>
       <w:r>
         <w:t>Compare the O(sqrt(N)) quantum queries against the O(N) classical brute-force search.</w:t>
       </w:r>
@@ -5421,8 +6163,15 @@
     </w:p>
     <w:p>
       <w:pPr>
-        <w:pStyle w:val="ListNumber"/>
-      </w:pPr>
+        <w:spacing w:after="80"/>
+        <w:ind w:left="576" w:hanging="576"/>
+      </w:pPr>
+      <w:r>
+        <w:rPr>
+          <w:b/>
+        </w:rPr>
+        <w:t xml:space="preserve">1.  </w:t>
+      </w:r>
       <w:r>
         <w:t>Open the quantum-fourier-transform lab, which provides 3, 4 and 5 qubit versions.</w:t>
       </w:r>
@@ -5439,8 +6188,15 @@
     </w:p>
     <w:p>
       <w:pPr>
-        <w:pStyle w:val="ListNumber"/>
-      </w:pPr>
+        <w:spacing w:after="80"/>
+        <w:ind w:left="576" w:hanging="576"/>
+      </w:pPr>
+      <w:r>
+        <w:rPr>
+          <w:b/>
+        </w:rPr>
+        <w:t xml:space="preserve">2.  </w:t>
+      </w:r>
       <w:r>
         <w:t>Apply a Hadamard to the most significant qubit to begin the QFT construction.</w:t>
       </w:r>
@@ -5467,8 +6223,15 @@
     </w:p>
     <w:p>
       <w:pPr>
-        <w:pStyle w:val="ListNumber"/>
-      </w:pPr>
+        <w:spacing w:after="80"/>
+        <w:ind w:left="576" w:hanging="576"/>
+      </w:pPr>
+      <w:r>
+        <w:rPr>
+          <w:b/>
+        </w:rPr>
+        <w:t xml:space="preserve">3.  </w:t>
+      </w:r>
       <w:r>
         <w:t>Apply controlled-phase rotations of pi/2, pi/4 and so on from each lower qubit to the current one.</w:t>
       </w:r>
@@ -5495,8 +6258,15 @@
     </w:p>
     <w:p>
       <w:pPr>
-        <w:pStyle w:val="ListNumber"/>
-      </w:pPr>
+        <w:spacing w:after="80"/>
+        <w:ind w:left="576" w:hanging="576"/>
+      </w:pPr>
+      <w:r>
+        <w:rPr>
+          <w:b/>
+        </w:rPr>
+        <w:t xml:space="preserve">4.  </w:t>
+      </w:r>
       <w:r>
         <w:t>Repeat the Hadamard and controlled-phase pattern for each remaining qubit in turn.</w:t>
       </w:r>
@@ -5513,8 +6283,15 @@
     </w:p>
     <w:p>
       <w:pPr>
-        <w:pStyle w:val="ListNumber"/>
-      </w:pPr>
+        <w:spacing w:after="80"/>
+        <w:ind w:left="576" w:hanging="576"/>
+      </w:pPr>
+      <w:r>
+        <w:rPr>
+          <w:b/>
+        </w:rPr>
+        <w:t xml:space="preserve">5.  </w:t>
+      </w:r>
       <w:r>
         <w:t>Add the final SWAP gates that reverse the qubit order to match the standard QFT convention.</w:t>
       </w:r>
@@ -5531,8 +6308,15 @@
     </w:p>
     <w:p>
       <w:pPr>
-        <w:pStyle w:val="ListNumber"/>
-      </w:pPr>
+        <w:spacing w:after="80"/>
+        <w:ind w:left="576" w:hanging="576"/>
+      </w:pPr>
+      <w:r>
+        <w:rPr>
+          <w:b/>
+        </w:rPr>
+        <w:t xml:space="preserve">6.  </w:t>
+      </w:r>
       <w:r>
         <w:t>Compare your circuit against Qiskit's built-in QFT to confirm they are equivalent.</w:t>
       </w:r>
@@ -5559,8 +6343,15 @@
     </w:p>
     <w:p>
       <w:pPr>
-        <w:pStyle w:val="ListNumber"/>
-      </w:pPr>
+        <w:spacing w:after="80"/>
+        <w:ind w:left="576" w:hanging="576"/>
+      </w:pPr>
+      <w:r>
+        <w:rPr>
+          <w:b/>
+        </w:rPr>
+        <w:t xml:space="preserve">7.  </w:t>
+      </w:r>
       <w:r>
         <w:t>Verify the output against a classical NumPy FFT of the same input state vector.</w:t>
       </w:r>
@@ -5577,8 +6368,15 @@
     </w:p>
     <w:p>
       <w:pPr>
-        <w:pStyle w:val="ListNumber"/>
-      </w:pPr>
+        <w:spacing w:after="80"/>
+        <w:ind w:left="576" w:hanging="576"/>
+      </w:pPr>
+      <w:r>
+        <w:rPr>
+          <w:b/>
+        </w:rPr>
+        <w:t xml:space="preserve">8.  </w:t>
+      </w:r>
       <w:r>
         <w:t>Run the 3-qubit QFT on IBM Quantum hardware and inspect the transpiled circuit depth.</w:t>
       </w:r>
@@ -5595,8 +6393,15 @@
     </w:p>
     <w:p>
       <w:pPr>
-        <w:pStyle w:val="ListNumber"/>
-      </w:pPr>
+        <w:spacing w:after="80"/>
+        <w:ind w:left="576" w:hanging="576"/>
+      </w:pPr>
+      <w:r>
+        <w:rPr>
+          <w:b/>
+        </w:rPr>
+        <w:t xml:space="preserve">9.  </w:t>
+      </w:r>
       <w:r>
         <w:t>Count the gates and confirm the QFT uses O(n^2) gates versus O(N log N) for the classical FFT.</w:t>
       </w:r>
@@ -5804,8 +6609,15 @@
     </w:p>
     <w:p>
       <w:pPr>
-        <w:pStyle w:val="ListNumber"/>
-      </w:pPr>
+        <w:spacing w:after="80"/>
+        <w:ind w:left="576" w:hanging="576"/>
+      </w:pPr>
+      <w:r>
+        <w:rPr>
+          <w:b/>
+        </w:rPr>
+        <w:t xml:space="preserve">1.  </w:t>
+      </w:r>
       <w:r>
         <w:t>Open the shor-algorithm lab and review the period-finding construction in main.py.</w:t>
       </w:r>
@@ -5822,16 +6634,30 @@
     </w:p>
     <w:p>
       <w:pPr>
-        <w:pStyle w:val="ListNumber"/>
-      </w:pPr>
+        <w:spacing w:after="80"/>
+        <w:ind w:left="576" w:hanging="576"/>
+      </w:pPr>
+      <w:r>
+        <w:rPr>
+          <w:b/>
+        </w:rPr>
+        <w:t xml:space="preserve">2.  </w:t>
+      </w:r>
       <w:r>
         <w:t>Understand the classical reduction: to factor N, pick a random a coprime to N and find the period r of a^x mod N.</w:t>
       </w:r>
     </w:p>
     <w:p>
       <w:pPr>
-        <w:pStyle w:val="ListNumber"/>
-      </w:pPr>
+        <w:spacing w:after="80"/>
+        <w:ind w:left="576" w:hanging="576"/>
+      </w:pPr>
+      <w:r>
+        <w:rPr>
+          <w:b/>
+        </w:rPr>
+        <w:t xml:space="preserve">3.  </w:t>
+      </w:r>
       <w:r>
         <w:t>Verify the reduction by hand for N = 15 and a = 7, listing the powers of 7 mod 15 until the sequence repeats.</w:t>
       </w:r>
@@ -5848,8 +6674,15 @@
     </w:p>
     <w:p>
       <w:pPr>
-        <w:pStyle w:val="ListNumber"/>
-      </w:pPr>
+        <w:spacing w:after="80"/>
+        <w:ind w:left="576" w:hanging="576"/>
+      </w:pPr>
+      <w:r>
+        <w:rPr>
+          <w:b/>
+        </w:rPr>
+        <w:t xml:space="preserve">4.  </w:t>
+      </w:r>
       <w:r>
         <w:t>Build the counting register in superposition with Hadamard gates.</w:t>
       </w:r>
@@ -5866,16 +6699,30 @@
     </w:p>
     <w:p>
       <w:pPr>
-        <w:pStyle w:val="ListNumber"/>
-      </w:pPr>
+        <w:spacing w:after="80"/>
+        <w:ind w:left="576" w:hanging="576"/>
+      </w:pPr>
+      <w:r>
+        <w:rPr>
+          <w:b/>
+        </w:rPr>
+        <w:t xml:space="preserve">5.  </w:t>
+      </w:r>
       <w:r>
         <w:t>Apply the controlled modular-exponentiation operations that encode a^x mod N.</w:t>
       </w:r>
     </w:p>
     <w:p>
       <w:pPr>
-        <w:pStyle w:val="ListNumber"/>
-      </w:pPr>
+        <w:spacing w:after="80"/>
+        <w:ind w:left="576" w:hanging="576"/>
+      </w:pPr>
+      <w:r>
+        <w:rPr>
+          <w:b/>
+        </w:rPr>
+        <w:t xml:space="preserve">6.  </w:t>
+      </w:r>
       <w:r>
         <w:t>Apply the inverse QFT to the counting register to extract the period information.</w:t>
       </w:r>
@@ -5892,8 +6739,15 @@
     </w:p>
     <w:p>
       <w:pPr>
-        <w:pStyle w:val="ListNumber"/>
-      </w:pPr>
+        <w:spacing w:after="80"/>
+        <w:ind w:left="576" w:hanging="576"/>
+      </w:pPr>
+      <w:r>
+        <w:rPr>
+          <w:b/>
+        </w:rPr>
+        <w:t xml:space="preserve">7.  </w:t>
+      </w:r>
       <w:r>
         <w:t>Measure the counting register and run the circuit on IBM Quantum hardware.</w:t>
       </w:r>
@@ -5910,16 +6764,30 @@
     </w:p>
     <w:p>
       <w:pPr>
-        <w:pStyle w:val="ListNumber"/>
-      </w:pPr>
+        <w:spacing w:after="80"/>
+        <w:ind w:left="576" w:hanging="576"/>
+      </w:pPr>
+      <w:r>
+        <w:rPr>
+          <w:b/>
+        </w:rPr>
+        <w:t xml:space="preserve">8.  </w:t>
+      </w:r>
       <w:r>
         <w:t>Use the continued-fractions method on the measured phase to recover the period r.</w:t>
       </w:r>
     </w:p>
     <w:p>
       <w:pPr>
-        <w:pStyle w:val="ListNumber"/>
-      </w:pPr>
+        <w:spacing w:after="80"/>
+        <w:ind w:left="576" w:hanging="576"/>
+      </w:pPr>
+      <w:r>
+        <w:rPr>
+          <w:b/>
+        </w:rPr>
+        <w:t xml:space="preserve">9.  </w:t>
+      </w:r>
       <w:r>
         <w:t>Compute the factors as gcd(a^(r/2) +/- 1, N) and confirm you obtain 3 and 5.</w:t>
       </w:r>
@@ -5946,8 +6814,15 @@
     </w:p>
     <w:p>
       <w:pPr>
-        <w:pStyle w:val="ListNumber"/>
-      </w:pPr>
+        <w:spacing w:after="80"/>
+        <w:ind w:left="576" w:hanging="576"/>
+      </w:pPr>
+      <w:r>
+        <w:rPr>
+          <w:b/>
+        </w:rPr>
+        <w:t xml:space="preserve">10.  </w:t>
+      </w:r>
       <w:r>
         <w:t>Estimate how many logical qubits would be required to factor a 2048-bit RSA modulus, and discuss the timeline risk.</w:t>
       </w:r>
@@ -6082,16 +6957,30 @@
     </w:p>
     <w:p>
       <w:pPr>
-        <w:pStyle w:val="ListNumber"/>
-      </w:pPr>
+        <w:spacing w:after="80"/>
+        <w:ind w:left="576" w:hanging="576"/>
+      </w:pPr>
+      <w:r>
+        <w:rPr>
+          <w:b/>
+        </w:rPr>
+        <w:t xml:space="preserve">1.  </w:t>
+      </w:r>
       <w:r>
         <w:t>List the cryptography used in a typical enterprise: TLS certificates, VPNs, code signing, database encryption and backups.</w:t>
       </w:r>
     </w:p>
     <w:p>
       <w:pPr>
-        <w:pStyle w:val="ListNumber"/>
-      </w:pPr>
+        <w:spacing w:after="80"/>
+        <w:ind w:left="576" w:hanging="576"/>
+      </w:pPr>
+      <w:r>
+        <w:rPr>
+          <w:b/>
+        </w:rPr>
+        <w:t xml:space="preserve">2.  </w:t>
+      </w:r>
       <w:r>
         <w:t>Inspect a real certificate to identify its public-key algorithm and key size.</w:t>
       </w:r>
@@ -6108,64 +6997,120 @@
     </w:p>
     <w:p>
       <w:pPr>
-        <w:pStyle w:val="ListNumber"/>
-      </w:pPr>
+        <w:spacing w:after="80"/>
+        <w:ind w:left="576" w:hanging="576"/>
+      </w:pPr>
+      <w:r>
+        <w:rPr>
+          <w:b/>
+        </w:rPr>
+        <w:t xml:space="preserve">3.  </w:t>
+      </w:r>
       <w:r>
         <w:t>Classify each algorithm as broken by Shor (RSA, ECC, Diffie-Hellman) or merely weakened by Grover (AES, SHA-2).</w:t>
       </w:r>
     </w:p>
     <w:p>
       <w:pPr>
-        <w:pStyle w:val="ListNumber"/>
-      </w:pPr>
+        <w:spacing w:after="80"/>
+        <w:ind w:left="576" w:hanging="576"/>
+      </w:pPr>
+      <w:r>
+        <w:rPr>
+          <w:b/>
+        </w:rPr>
+        <w:t xml:space="preserve">4.  </w:t>
+      </w:r>
       <w:r>
         <w:t>Record that Grover halves the effective key length, so AES-128 falls to 64-bit security while AES-256 remains safe.</w:t>
       </w:r>
     </w:p>
     <w:p>
       <w:pPr>
-        <w:pStyle w:val="ListNumber"/>
-      </w:pPr>
+        <w:spacing w:after="80"/>
+        <w:ind w:left="576" w:hanging="576"/>
+      </w:pPr>
+      <w:r>
+        <w:rPr>
+          <w:b/>
+        </w:rPr>
+        <w:t xml:space="preserve">5.  </w:t>
+      </w:r>
       <w:r>
         <w:t>Map each broken algorithm to its NIST replacement: ML-KEM for key exchange, ML-DSA or SLH-DSA for signatures.</w:t>
       </w:r>
     </w:p>
     <w:p>
       <w:pPr>
-        <w:pStyle w:val="ListNumber"/>
-      </w:pPr>
+        <w:spacing w:after="80"/>
+        <w:ind w:left="576" w:hanging="576"/>
+      </w:pPr>
+      <w:r>
+        <w:rPr>
+          <w:b/>
+        </w:rPr>
+        <w:t xml:space="preserve">6.  </w:t>
+      </w:r>
       <w:r>
         <w:t>Note the standards: FIPS 203 (ML-KEM/Kyber), FIPS 204 (ML-DSA/Dilithium) and FIPS 205 (SLH-DSA/SPHINCS+).</w:t>
       </w:r>
     </w:p>
     <w:p>
       <w:pPr>
-        <w:pStyle w:val="ListNumber"/>
-      </w:pPr>
+        <w:spacing w:after="80"/>
+        <w:ind w:left="576" w:hanging="576"/>
+      </w:pPr>
+      <w:r>
+        <w:rPr>
+          <w:b/>
+        </w:rPr>
+        <w:t xml:space="preserve">7.  </w:t>
+      </w:r>
       <w:r>
         <w:t>Score each asset for harvest-now-decrypt-later risk based on how long its data must stay confidential.</w:t>
       </w:r>
     </w:p>
     <w:p>
       <w:pPr>
-        <w:pStyle w:val="ListNumber"/>
-      </w:pPr>
+        <w:spacing w:after="80"/>
+        <w:ind w:left="576" w:hanging="576"/>
+      </w:pPr>
+      <w:r>
+        <w:rPr>
+          <w:b/>
+        </w:rPr>
+        <w:t xml:space="preserve">8.  </w:t>
+      </w:r>
       <w:r>
         <w:t>Identify which systems need crypto-agility first — long-lived secrets and long-lived devices rank highest.</w:t>
       </w:r>
     </w:p>
     <w:p>
       <w:pPr>
-        <w:pStyle w:val="ListNumber"/>
-      </w:pPr>
+        <w:spacing w:after="80"/>
+        <w:ind w:left="576" w:hanging="576"/>
+      </w:pPr>
+      <w:r>
+        <w:rPr>
+          <w:b/>
+        </w:rPr>
+        <w:t xml:space="preserve">9.  </w:t>
+      </w:r>
       <w:r>
         <w:t>Produce a prioritised migration table listing asset, current algorithm, PQC replacement, risk score and target date.</w:t>
       </w:r>
     </w:p>
     <w:p>
       <w:pPr>
-        <w:pStyle w:val="ListNumber"/>
-      </w:pPr>
+        <w:spacing w:after="80"/>
+        <w:ind w:left="576" w:hanging="576"/>
+      </w:pPr>
+      <w:r>
+        <w:rPr>
+          <w:b/>
+        </w:rPr>
+        <w:t xml:space="preserve">10.  </w:t>
+      </w:r>
       <w:r>
         <w:t>Recommend hybrid classical-plus-PQC key exchange as the safe transitional deployment strategy.</w:t>
       </w:r>
@@ -6373,8 +7318,15 @@
     </w:p>
     <w:p>
       <w:pPr>
-        <w:pStyle w:val="ListNumber"/>
-      </w:pPr>
+        <w:spacing w:after="80"/>
+        <w:ind w:left="576" w:hanging="576"/>
+      </w:pPr>
+      <w:r>
+        <w:rPr>
+          <w:b/>
+        </w:rPr>
+        <w:t xml:space="preserve">1.  </w:t>
+      </w:r>
       <w:r>
         <w:t>Open the vqe lab folder and review the ansatz and Hamiltonian definitions in main.py.</w:t>
       </w:r>
@@ -6391,40 +7343,75 @@
     </w:p>
     <w:p>
       <w:pPr>
-        <w:pStyle w:val="ListNumber"/>
-      </w:pPr>
+        <w:spacing w:after="80"/>
+        <w:ind w:left="576" w:hanging="576"/>
+      </w:pPr>
+      <w:r>
+        <w:rPr>
+          <w:b/>
+        </w:rPr>
+        <w:t xml:space="preserve">2.  </w:t>
+      </w:r>
       <w:r>
         <w:t>Understand the hybrid loop: a parameterised quantum circuit prepares a trial state, a classical optimiser updates the parameters.</w:t>
       </w:r>
     </w:p>
     <w:p>
       <w:pPr>
-        <w:pStyle w:val="ListNumber"/>
-      </w:pPr>
+        <w:spacing w:after="80"/>
+        <w:ind w:left="576" w:hanging="576"/>
+      </w:pPr>
+      <w:r>
+        <w:rPr>
+          <w:b/>
+        </w:rPr>
+        <w:t xml:space="preserve">3.  </w:t>
+      </w:r>
       <w:r>
         <w:t>Inspect the H2 Hamiltonian expressed as a weighted sum of Pauli strings.</w:t>
       </w:r>
     </w:p>
     <w:p>
       <w:pPr>
-        <w:pStyle w:val="ListNumber"/>
-      </w:pPr>
+        <w:spacing w:after="80"/>
+        <w:ind w:left="576" w:hanging="576"/>
+      </w:pPr>
+      <w:r>
+        <w:rPr>
+          <w:b/>
+        </w:rPr>
+        <w:t xml:space="preserve">4.  </w:t>
+      </w:r>
       <w:r>
         <w:t>Build the parameterised ansatz circuit whose rotation angles are the variational parameters.</w:t>
       </w:r>
     </w:p>
     <w:p>
       <w:pPr>
-        <w:pStyle w:val="ListNumber"/>
-      </w:pPr>
+        <w:spacing w:after="80"/>
+        <w:ind w:left="576" w:hanging="576"/>
+      </w:pPr>
+      <w:r>
+        <w:rPr>
+          <w:b/>
+        </w:rPr>
+        <w:t xml:space="preserve">5.  </w:t>
+      </w:r>
       <w:r>
         <w:t>Define the cost function that measures the expectation value of the Hamiltonian for a given parameter set.</w:t>
       </w:r>
     </w:p>
     <w:p>
       <w:pPr>
-        <w:pStyle w:val="ListNumber"/>
-      </w:pPr>
+        <w:spacing w:after="80"/>
+        <w:ind w:left="576" w:hanging="576"/>
+      </w:pPr>
+      <w:r>
+        <w:rPr>
+          <w:b/>
+        </w:rPr>
+        <w:t xml:space="preserve">6.  </w:t>
+      </w:r>
       <w:r>
         <w:t>Run the classical optimiser to minimise the energy over the parameters.</w:t>
       </w:r>
@@ -6441,32 +7428,60 @@
     </w:p>
     <w:p>
       <w:pPr>
-        <w:pStyle w:val="ListNumber"/>
-      </w:pPr>
+        <w:spacing w:after="80"/>
+        <w:ind w:left="576" w:hanging="576"/>
+      </w:pPr>
+      <w:r>
+        <w:rPr>
+          <w:b/>
+        </w:rPr>
+        <w:t xml:space="preserve">7.  </w:t>
+      </w:r>
       <w:r>
         <w:t>Plot energy against iteration and confirm the value converges downward toward the ground state.</w:t>
       </w:r>
     </w:p>
     <w:p>
       <w:pPr>
-        <w:pStyle w:val="ListNumber"/>
-      </w:pPr>
+        <w:spacing w:after="80"/>
+        <w:ind w:left="576" w:hanging="576"/>
+      </w:pPr>
+      <w:r>
+        <w:rPr>
+          <w:b/>
+        </w:rPr>
+        <w:t xml:space="preserve">8.  </w:t>
+      </w:r>
       <w:r>
         <w:t>Compare the converged energy against the known exact H2 ground-state energy of about -1.137 Hartree.</w:t>
       </w:r>
     </w:p>
     <w:p>
       <w:pPr>
-        <w:pStyle w:val="ListNumber"/>
-      </w:pPr>
+        <w:spacing w:after="80"/>
+        <w:ind w:left="576" w:hanging="576"/>
+      </w:pPr>
+      <w:r>
+        <w:rPr>
+          <w:b/>
+        </w:rPr>
+        <w:t xml:space="preserve">9.  </w:t>
+      </w:r>
       <w:r>
         <w:t>Explain why VQE suits today's noisy hardware — shallow circuits and a classical optimiser tolerate some noise.</w:t>
       </w:r>
     </w:p>
     <w:p>
       <w:pPr>
-        <w:pStyle w:val="ListNumber"/>
-      </w:pPr>
+        <w:spacing w:after="80"/>
+        <w:ind w:left="576" w:hanging="576"/>
+      </w:pPr>
+      <w:r>
+        <w:rPr>
+          <w:b/>
+        </w:rPr>
+        <w:t xml:space="preserve">10.  </w:t>
+      </w:r>
       <w:r>
         <w:t>Discuss which pharmaceutical and materials problems become tractable as qubit counts grow.</w:t>
       </w:r>
@@ -6601,8 +7616,15 @@
     </w:p>
     <w:p>
       <w:pPr>
-        <w:pStyle w:val="ListNumber"/>
-      </w:pPr>
+        <w:spacing w:after="80"/>
+        <w:ind w:left="576" w:hanging="576"/>
+      </w:pPr>
+      <w:r>
+        <w:rPr>
+          <w:b/>
+        </w:rPr>
+        <w:t xml:space="preserve">1.  </w:t>
+      </w:r>
       <w:r>
         <w:t>Open the qaoa lab folder and review the Max-Cut problem definition in main.py.</w:t>
       </w:r>
@@ -6619,40 +7641,75 @@
     </w:p>
     <w:p>
       <w:pPr>
-        <w:pStyle w:val="ListNumber"/>
-      </w:pPr>
+        <w:spacing w:after="80"/>
+        <w:ind w:left="576" w:hanging="576"/>
+      </w:pPr>
+      <w:r>
+        <w:rPr>
+          <w:b/>
+        </w:rPr>
+        <w:t xml:space="preserve">2.  </w:t>
+      </w:r>
       <w:r>
         <w:t>Define a small graph whose vertices represent assets and whose edges carry correlation weights.</w:t>
       </w:r>
     </w:p>
     <w:p>
       <w:pPr>
-        <w:pStyle w:val="ListNumber"/>
-      </w:pPr>
+        <w:spacing w:after="80"/>
+        <w:ind w:left="576" w:hanging="576"/>
+      </w:pPr>
+      <w:r>
+        <w:rPr>
+          <w:b/>
+        </w:rPr>
+        <w:t xml:space="preserve">3.  </w:t>
+      </w:r>
       <w:r>
         <w:t>Encode the Max-Cut objective as a cost Hamiltonian built from ZZ terms on each edge.</w:t>
       </w:r>
     </w:p>
     <w:p>
       <w:pPr>
-        <w:pStyle w:val="ListNumber"/>
-      </w:pPr>
+        <w:spacing w:after="80"/>
+        <w:ind w:left="576" w:hanging="576"/>
+      </w:pPr>
+      <w:r>
+        <w:rPr>
+          <w:b/>
+        </w:rPr>
+        <w:t xml:space="preserve">4.  </w:t>
+      </w:r>
       <w:r>
         <w:t>Build the QAOA circuit alternating the cost Hamiltonian and the mixer Hamiltonian for p layers.</w:t>
       </w:r>
     </w:p>
     <w:p>
       <w:pPr>
-        <w:pStyle w:val="ListNumber"/>
-      </w:pPr>
+        <w:spacing w:after="80"/>
+        <w:ind w:left="576" w:hanging="576"/>
+      </w:pPr>
+      <w:r>
+        <w:rPr>
+          <w:b/>
+        </w:rPr>
+        <w:t xml:space="preserve">5.  </w:t>
+      </w:r>
       <w:r>
         <w:t>Initialise the register in equal superposition with Hadamard gates before the first layer.</w:t>
       </w:r>
     </w:p>
     <w:p>
       <w:pPr>
-        <w:pStyle w:val="ListNumber"/>
-      </w:pPr>
+        <w:spacing w:after="80"/>
+        <w:ind w:left="576" w:hanging="576"/>
+      </w:pPr>
+      <w:r>
+        <w:rPr>
+          <w:b/>
+        </w:rPr>
+        <w:t xml:space="preserve">6.  </w:t>
+      </w:r>
       <w:r>
         <w:t>Run the classical optimiser over the gamma and beta parameters to maximise the expected cut value.</w:t>
       </w:r>
@@ -6669,32 +7726,60 @@
     </w:p>
     <w:p>
       <w:pPr>
-        <w:pStyle w:val="ListNumber"/>
-      </w:pPr>
+        <w:spacing w:after="80"/>
+        <w:ind w:left="576" w:hanging="576"/>
+      </w:pPr>
+      <w:r>
+        <w:rPr>
+          <w:b/>
+        </w:rPr>
+        <w:t xml:space="preserve">7.  </w:t>
+      </w:r>
       <w:r>
         <w:t>Sample the optimised circuit and identify the most frequent bit string as the proposed solution.</w:t>
       </w:r>
     </w:p>
     <w:p>
       <w:pPr>
-        <w:pStyle w:val="ListNumber"/>
-      </w:pPr>
+        <w:spacing w:after="80"/>
+        <w:ind w:left="576" w:hanging="576"/>
+      </w:pPr>
+      <w:r>
+        <w:rPr>
+          <w:b/>
+        </w:rPr>
+        <w:t xml:space="preserve">8.  </w:t>
+      </w:r>
       <w:r>
         <w:t>Brute-force all 2^n partitions classically and compare the optimal cut against the QAOA result.</w:t>
       </w:r>
     </w:p>
     <w:p>
       <w:pPr>
-        <w:pStyle w:val="ListNumber"/>
-      </w:pPr>
+        <w:spacing w:after="80"/>
+        <w:ind w:left="576" w:hanging="576"/>
+      </w:pPr>
+      <w:r>
+        <w:rPr>
+          <w:b/>
+        </w:rPr>
+        <w:t xml:space="preserve">9.  </w:t>
+      </w:r>
       <w:r>
         <w:t>Increase the number of layers p and observe how the approximation ratio improves.</w:t>
       </w:r>
     </w:p>
     <w:p>
       <w:pPr>
-        <w:pStyle w:val="ListNumber"/>
-      </w:pPr>
+        <w:spacing w:after="80"/>
+        <w:ind w:left="576" w:hanging="576"/>
+      </w:pPr>
+      <w:r>
+        <w:rPr>
+          <w:b/>
+        </w:rPr>
+        <w:t xml:space="preserve">10.  </w:t>
+      </w:r>
       <w:r>
         <w:t>Map the result back to the finance framing: which assets fall on each side of the partition, and why that matters for diversification.</w:t>
       </w:r>
@@ -6902,8 +7987,15 @@
     </w:p>
     <w:p>
       <w:pPr>
-        <w:pStyle w:val="ListNumber"/>
-      </w:pPr>
+        <w:spacing w:after="80"/>
+        <w:ind w:left="576" w:hanging="576"/>
+      </w:pPr>
+      <w:r>
+        <w:rPr>
+          <w:b/>
+        </w:rPr>
+        <w:t xml:space="preserve">1.  </w:t>
+      </w:r>
       <w:r>
         <w:t>Open the quantum-error-correction lab and review the bit-flip code implementation.</w:t>
       </w:r>
@@ -6920,8 +8012,15 @@
     </w:p>
     <w:p>
       <w:pPr>
-        <w:pStyle w:val="ListNumber"/>
-      </w:pPr>
+        <w:spacing w:after="80"/>
+        <w:ind w:left="576" w:hanging="576"/>
+      </w:pPr>
+      <w:r>
+        <w:rPr>
+          <w:b/>
+        </w:rPr>
+        <w:t xml:space="preserve">2.  </w:t>
+      </w:r>
       <w:r>
         <w:t>Encode one logical qubit into three physical qubits using two CNOT gates.</w:t>
       </w:r>
@@ -6948,8 +8047,15 @@
     </w:p>
     <w:p>
       <w:pPr>
-        <w:pStyle w:val="ListNumber"/>
-      </w:pPr>
+        <w:spacing w:after="80"/>
+        <w:ind w:left="576" w:hanging="576"/>
+      </w:pPr>
+      <w:r>
+        <w:rPr>
+          <w:b/>
+        </w:rPr>
+        <w:t xml:space="preserve">3.  </w:t>
+      </w:r>
       <w:r>
         <w:t>Inject a bit-flip error by applying an X gate to one of the three data qubits.</w:t>
       </w:r>
@@ -6966,8 +8072,15 @@
     </w:p>
     <w:p>
       <w:pPr>
-        <w:pStyle w:val="ListNumber"/>
-      </w:pPr>
+        <w:spacing w:after="80"/>
+        <w:ind w:left="576" w:hanging="576"/>
+      </w:pPr>
+      <w:r>
+        <w:rPr>
+          <w:b/>
+        </w:rPr>
+        <w:t xml:space="preserve">4.  </w:t>
+      </w:r>
       <w:r>
         <w:t>Compute the syndrome using two ancilla qubits and four CNOT gates comparing qubit pairs.</w:t>
       </w:r>
@@ -6984,8 +8097,15 @@
     </w:p>
     <w:p>
       <w:pPr>
-        <w:pStyle w:val="ListNumber"/>
-      </w:pPr>
+        <w:spacing w:after="80"/>
+        <w:ind w:left="576" w:hanging="576"/>
+      </w:pPr>
+      <w:r>
+        <w:rPr>
+          <w:b/>
+        </w:rPr>
+        <w:t xml:space="preserve">5.  </w:t>
+      </w:r>
       <w:r>
         <w:t>Measure only the ancillas — this reveals which qubit flipped without measuring the logical state.</w:t>
       </w:r>
@@ -7002,24 +8122,45 @@
     </w:p>
     <w:p>
       <w:pPr>
-        <w:pStyle w:val="ListNumber"/>
-      </w:pPr>
+        <w:spacing w:after="80"/>
+        <w:ind w:left="576" w:hanging="576"/>
+      </w:pPr>
+      <w:r>
+        <w:rPr>
+          <w:b/>
+        </w:rPr>
+        <w:t xml:space="preserve">6.  </w:t>
+      </w:r>
       <w:r>
         <w:t>Decode the syndrome: 00 means no error, 10 means qubit 0, 11 means qubit 1 and 01 means qubit 2.</w:t>
       </w:r>
     </w:p>
     <w:p>
       <w:pPr>
-        <w:pStyle w:val="ListNumber"/>
-      </w:pPr>
+        <w:spacing w:after="80"/>
+        <w:ind w:left="576" w:hanging="576"/>
+      </w:pPr>
+      <w:r>
+        <w:rPr>
+          <w:b/>
+        </w:rPr>
+        <w:t xml:space="preserve">7.  </w:t>
+      </w:r>
       <w:r>
         <w:t>Apply the corrective X gate to the qubit identified by the syndrome and confirm the state is restored.</w:t>
       </w:r>
     </w:p>
     <w:p>
       <w:pPr>
-        <w:pStyle w:val="ListNumber"/>
-      </w:pPr>
+        <w:spacing w:after="80"/>
+        <w:ind w:left="576" w:hanging="576"/>
+      </w:pPr>
+      <w:r>
+        <w:rPr>
+          <w:b/>
+        </w:rPr>
+        <w:t xml:space="preserve">8.  </w:t>
+      </w:r>
       <w:r>
         <w:t>Run the bit-flip code on IBM Quantum hardware and verify the correction succeeds.</w:t>
       </w:r>
@@ -7036,8 +8177,15 @@
     </w:p>
     <w:p>
       <w:pPr>
-        <w:pStyle w:val="ListNumber"/>
-      </w:pPr>
+        <w:spacing w:after="80"/>
+        <w:ind w:left="576" w:hanging="576"/>
+      </w:pPr>
+      <w:r>
+        <w:rPr>
+          <w:b/>
+        </w:rPr>
+        <w:t xml:space="preserve">9.  </w:t>
+      </w:r>
       <w:r>
         <w:t>Move to the phase-flip code and note that conjugating with Hadamards turns Z errors into X errors.</w:t>
       </w:r>
@@ -7054,8 +8202,15 @@
     </w:p>
     <w:p>
       <w:pPr>
-        <w:pStyle w:val="ListNumber"/>
-      </w:pPr>
+        <w:spacing w:after="80"/>
+        <w:ind w:left="576" w:hanging="576"/>
+      </w:pPr>
+      <w:r>
+        <w:rPr>
+          <w:b/>
+        </w:rPr>
+        <w:t xml:space="preserve">10.  </w:t>
+      </w:r>
       <w:r>
         <w:t>Explain why measuring the syndrome rather than the data qubits is what makes quantum error correction possible at all.</w:t>
       </w:r>
@@ -7190,8 +8345,15 @@
     </w:p>
     <w:p>
       <w:pPr>
-        <w:pStyle w:val="ListNumber"/>
-      </w:pPr>
+        <w:spacing w:after="80"/>
+        <w:ind w:left="576" w:hanging="576"/>
+      </w:pPr>
+      <w:r>
+        <w:rPr>
+          <w:b/>
+        </w:rPr>
+        <w:t xml:space="preserve">1.  </w:t>
+      </w:r>
       <w:r>
         <w:t>Open the shor-9qubit-code folder and review how it concatenates the phase-flip and bit-flip codes.</w:t>
       </w:r>
@@ -7208,32 +8370,60 @@
     </w:p>
     <w:p>
       <w:pPr>
-        <w:pStyle w:val="ListNumber"/>
-      </w:pPr>
+        <w:spacing w:after="80"/>
+        <w:ind w:left="576" w:hanging="576"/>
+      </w:pPr>
+      <w:r>
+        <w:rPr>
+          <w:b/>
+        </w:rPr>
+        <w:t xml:space="preserve">2.  </w:t>
+      </w:r>
       <w:r>
         <w:t>Understand the structure: one logical qubit becomes three blocks of three, protecting against both X and Z errors.</w:t>
       </w:r>
     </w:p>
     <w:p>
       <w:pPr>
-        <w:pStyle w:val="ListNumber"/>
-      </w:pPr>
+        <w:spacing w:after="80"/>
+        <w:ind w:left="576" w:hanging="576"/>
+      </w:pPr>
+      <w:r>
+        <w:rPr>
+          <w:b/>
+        </w:rPr>
+        <w:t xml:space="preserve">3.  </w:t>
+      </w:r>
       <w:r>
         <w:t>Encode the logical qubit across all nine physical qubits.</w:t>
       </w:r>
     </w:p>
     <w:p>
       <w:pPr>
-        <w:pStyle w:val="ListNumber"/>
-      </w:pPr>
+        <w:spacing w:after="80"/>
+        <w:ind w:left="576" w:hanging="576"/>
+      </w:pPr>
+      <w:r>
+        <w:rPr>
+          <w:b/>
+        </w:rPr>
+        <w:t xml:space="preserve">4.  </w:t>
+      </w:r>
       <w:r>
         <w:t>Inject an arbitrary single-qubit error — X, Z or Y — into any one of the nine qubits.</w:t>
       </w:r>
     </w:p>
     <w:p>
       <w:pPr>
-        <w:pStyle w:val="ListNumber"/>
-      </w:pPr>
+        <w:spacing w:after="80"/>
+        <w:ind w:left="576" w:hanging="576"/>
+      </w:pPr>
+      <w:r>
+        <w:rPr>
+          <w:b/>
+        </w:rPr>
+        <w:t xml:space="preserve">5.  </w:t>
+      </w:r>
       <w:r>
         <w:t>Measure the syndrome and confirm the code identifies and corrects the error whichever type it was.</w:t>
       </w:r>
@@ -7250,8 +8440,15 @@
     </w:p>
     <w:p>
       <w:pPr>
-        <w:pStyle w:val="ListNumber"/>
-      </w:pPr>
+        <w:spacing w:after="80"/>
+        <w:ind w:left="576" w:hanging="576"/>
+      </w:pPr>
+      <w:r>
+        <w:rPr>
+          <w:b/>
+        </w:rPr>
+        <w:t xml:space="preserve">6.  </w:t>
+      </w:r>
       <w:r>
         <w:t>Move to the steane-7qubit-code folder and review the CSS construction based on the Hamming code.</w:t>
       </w:r>
@@ -7268,8 +8465,15 @@
     </w:p>
     <w:p>
       <w:pPr>
-        <w:pStyle w:val="ListNumber"/>
-      </w:pPr>
+        <w:spacing w:after="80"/>
+        <w:ind w:left="576" w:hanging="576"/>
+      </w:pPr>
+      <w:r>
+        <w:rPr>
+          <w:b/>
+        </w:rPr>
+        <w:t xml:space="preserve">7.  </w:t>
+      </w:r>
       <w:r>
         <w:t>Run the Steane code and confirm it also corrects an arbitrary single-qubit error using only seven qubits.</w:t>
       </w:r>
@@ -7286,24 +8490,45 @@
     </w:p>
     <w:p>
       <w:pPr>
-        <w:pStyle w:val="ListNumber"/>
-      </w:pPr>
+        <w:spacing w:after="80"/>
+        <w:ind w:left="576" w:hanging="576"/>
+      </w:pPr>
+      <w:r>
+        <w:rPr>
+          <w:b/>
+        </w:rPr>
+        <w:t xml:space="preserve">8.  </w:t>
+      </w:r>
       <w:r>
         <w:t>Compare the overhead of the two codes and note why Steane is more efficient than Shor.</w:t>
       </w:r>
     </w:p>
     <w:p>
       <w:pPr>
-        <w:pStyle w:val="ListNumber"/>
-      </w:pPr>
+        <w:spacing w:after="80"/>
+        <w:ind w:left="576" w:hanging="576"/>
+      </w:pPr>
+      <w:r>
+        <w:rPr>
+          <w:b/>
+        </w:rPr>
+        <w:t xml:space="preserve">9.  </w:t>
+      </w:r>
       <w:r>
         <w:t>Read about surface codes and why their 2D nearest-neighbour layout suits real superconducting hardware.</w:t>
       </w:r>
     </w:p>
     <w:p>
       <w:pPr>
-        <w:pStyle w:val="ListNumber"/>
-      </w:pPr>
+        <w:spacing w:after="80"/>
+        <w:ind w:left="576" w:hanging="576"/>
+      </w:pPr>
+      <w:r>
+        <w:rPr>
+          <w:b/>
+        </w:rPr>
+        <w:t xml:space="preserve">10.  </w:t>
+      </w:r>
       <w:r>
         <w:t>Discuss the error threshold: below it, concatenating codes suppresses errors faster than they accumulate.</w:t>
       </w:r>

</xml_diff>